<commit_message>
2nd parte de la unidad-2 actividad-1
</commit_message>
<xml_diff>
--- a/Actividad 1 Unidad 2 Usuario/INVESTIACION ACT 1.docx
+++ b/Actividad 1 Unidad 2 Usuario/INVESTIACION ACT 1.docx
@@ -1,6 +1,6 @@
 
 <file path=word/document.xml><?xml version="1.0" encoding="utf-8"?>
-<w:document xmlns:wpc="http://schemas.microsoft.com/office/word/2010/wordprocessingCanvas" xmlns:cx="http://schemas.microsoft.com/office/drawing/2014/chartex" xmlns:cx1="http://schemas.microsoft.com/office/drawing/2015/9/8/chartex" xmlns:cx2="http://schemas.microsoft.com/office/drawing/2015/10/21/chartex" xmlns:cx3="http://schemas.microsoft.com/office/drawing/2016/5/9/chartex" xmlns:cx4="http://schemas.microsoft.com/office/drawing/2016/5/10/chartex" xmlns:cx5="http://schemas.microsoft.com/office/drawing/2016/5/11/chartex" xmlns:cx6="http://schemas.microsoft.com/office/drawing/2016/5/12/chartex" xmlns:cx7="http://schemas.microsoft.com/office/drawing/2016/5/13/chartex" xmlns:cx8="http://schemas.microsoft.com/office/drawing/2016/5/14/chartex" xmlns:mc="http://schemas.openxmlformats.org/markup-compatibility/2006" xmlns:aink="http://schemas.microsoft.com/office/drawing/2016/ink" xmlns:am3d="http://schemas.microsoft.com/office/drawing/2017/model3d" xmlns:o="urn:schemas-microsoft-com:office:office" xmlns:oel="http://schemas.microsoft.com/office/2019/extlst" xmlns:r="http://schemas.openxmlformats.org/officeDocument/2006/relationships" xmlns:m="http://schemas.openxmlformats.org/officeDocument/2006/math" xmlns:v="urn:schemas-microsoft-com:vml" xmlns:wp14="http://schemas.microsoft.com/office/word/2010/wordprocessingDrawing" xmlns:wp="http://schemas.openxmlformats.org/drawingml/2006/wordprocessingDrawing" xmlns:w10="urn:schemas-microsoft-com:office:word" xmlns:w="http://schemas.openxmlformats.org/wordprocessingml/2006/main" xmlns:w14="http://schemas.microsoft.com/office/word/2010/wordml" xmlns:w15="http://schemas.microsoft.com/office/word/2012/wordml" xmlns:w16cex="http://schemas.microsoft.com/office/word/2018/wordml/cex" xmlns:w16cid="http://schemas.microsoft.com/office/word/2016/wordml/cid" xmlns:w16="http://schemas.microsoft.com/office/word/2018/wordml" xmlns:w16du="http://schemas.microsoft.com/office/word/2023/wordml/word16du" xmlns:w16sdtdh="http://schemas.microsoft.com/office/word/2020/wordml/sdtdatahash" xmlns:w16se="http://schemas.microsoft.com/office/word/2015/wordml/symex" xmlns:wpg="http://schemas.microsoft.com/office/word/2010/wordprocessingGroup" xmlns:wpi="http://schemas.microsoft.com/office/word/2010/wordprocessingInk" xmlns:wne="http://schemas.microsoft.com/office/word/2006/wordml" xmlns:wps="http://schemas.microsoft.com/office/word/2010/wordprocessingShape" mc:Ignorable="w14 w15 w16se w16cid w16 w16cex w16sdtdh w16du wp14">
+<w:document xmlns:wpc="http://schemas.microsoft.com/office/word/2010/wordprocessingCanvas" xmlns:cx="http://schemas.microsoft.com/office/drawing/2014/chartex" xmlns:cx1="http://schemas.microsoft.com/office/drawing/2015/9/8/chartex" xmlns:cx2="http://schemas.microsoft.com/office/drawing/2015/10/21/chartex" xmlns:cx3="http://schemas.microsoft.com/office/drawing/2016/5/9/chartex" xmlns:cx4="http://schemas.microsoft.com/office/drawing/2016/5/10/chartex" xmlns:cx5="http://schemas.microsoft.com/office/drawing/2016/5/11/chartex" xmlns:cx6="http://schemas.microsoft.com/office/drawing/2016/5/12/chartex" xmlns:cx7="http://schemas.microsoft.com/office/drawing/2016/5/13/chartex" xmlns:cx8="http://schemas.microsoft.com/office/drawing/2016/5/14/chartex" xmlns:mc="http://schemas.openxmlformats.org/markup-compatibility/2006" xmlns:aink="http://schemas.microsoft.com/office/drawing/2016/ink" xmlns:am3d="http://schemas.microsoft.com/office/drawing/2017/model3d" xmlns:o="urn:schemas-microsoft-com:office:office" xmlns:oel="http://schemas.microsoft.com/office/2019/extlst" xmlns:r="http://schemas.openxmlformats.org/officeDocument/2006/relationships" xmlns:m="http://schemas.openxmlformats.org/officeDocument/2006/math" xmlns:v="urn:schemas-microsoft-com:vml" xmlns:wp14="http://schemas.microsoft.com/office/word/2010/wordprocessingDrawing" xmlns:wp="http://schemas.openxmlformats.org/drawingml/2006/wordprocessingDrawing" xmlns:w10="urn:schemas-microsoft-com:office:word" xmlns:w="http://schemas.openxmlformats.org/wordprocessingml/2006/main" xmlns:w14="http://schemas.microsoft.com/office/word/2010/wordml" xmlns:w15="http://schemas.microsoft.com/office/word/2012/wordml" xmlns:w16cex="http://schemas.microsoft.com/office/word/2018/wordml/cex" xmlns:w16cid="http://schemas.microsoft.com/office/word/2016/wordml/cid" xmlns:w16="http://schemas.microsoft.com/office/word/2018/wordml" xmlns:w16du="http://schemas.microsoft.com/office/word/2023/wordml/word16du" xmlns:w16sdtdh="http://schemas.microsoft.com/office/word/2020/wordml/sdtdatahash" xmlns:w16sdtfl="http://schemas.microsoft.com/office/word/2024/wordml/sdtformatlock" xmlns:w16se="http://schemas.microsoft.com/office/word/2015/wordml/symex" xmlns:wpg="http://schemas.microsoft.com/office/word/2010/wordprocessingGroup" xmlns:wpi="http://schemas.microsoft.com/office/word/2010/wordprocessingInk" xmlns:wne="http://schemas.microsoft.com/office/word/2006/wordml" xmlns:wps="http://schemas.microsoft.com/office/word/2010/wordprocessingShape" mc:Ignorable="w14 w15 w16se w16cid w16 w16cex w16sdtdh w16sdtfl w16du wp14">
   <w:body>
     <w:p>
       <w:pPr>
@@ -1279,6 +1279,7 @@
           <w:rFonts w:ascii="Arial" w:eastAsia="Times New Roman" w:hAnsi="Arial" w:cs="Arial"/>
           <w:color w:val="1F1F1F"/>
           <w:kern w:val="0"/>
+          <w:bdr w:val="none" w:sz="0" w:space="0" w:color="auto" w:frame="1"/>
           <w:lang w:eastAsia="es-MX"/>
           <w14:ligatures w14:val="none"/>
         </w:rPr>
@@ -1295,7 +1296,505 @@
         <w:t>Capacidad del software para ser transferido, ejecutado e instalado con éxito de un entorno operativo, plataforma o hardware a otro sin requerir cambios significativos en su código.</w:t>
       </w:r>
     </w:p>
-    <w:p/>
+    <w:p>
+      <w:pPr>
+        <w:spacing w:after="0" w:line="240" w:lineRule="auto"/>
+        <w:rPr>
+          <w:rFonts w:ascii="Arial" w:eastAsia="Times New Roman" w:hAnsi="Arial" w:cs="Arial"/>
+          <w:color w:val="1F1F1F"/>
+          <w:kern w:val="0"/>
+          <w:bdr w:val="none" w:sz="0" w:space="0" w:color="auto" w:frame="1"/>
+          <w:lang w:eastAsia="es-MX"/>
+          <w14:ligatures w14:val="none"/>
+        </w:rPr>
+      </w:pPr>
+    </w:p>
+    <w:p>
+      <w:pPr>
+        <w:rPr>
+          <w:b/>
+          <w:bCs/>
+          <w:sz w:val="40"/>
+          <w:szCs w:val="40"/>
+        </w:rPr>
+      </w:pPr>
+    </w:p>
+    <w:p>
+      <w:pPr>
+        <w:rPr>
+          <w:b/>
+          <w:bCs/>
+          <w:sz w:val="40"/>
+          <w:szCs w:val="40"/>
+        </w:rPr>
+      </w:pPr>
+    </w:p>
+    <w:p>
+      <w:pPr>
+        <w:rPr>
+          <w:b/>
+          <w:bCs/>
+          <w:sz w:val="40"/>
+          <w:szCs w:val="40"/>
+        </w:rPr>
+      </w:pPr>
+      <w:r>
+        <w:rPr>
+          <w:b/>
+          <w:bCs/>
+          <w:sz w:val="40"/>
+          <w:szCs w:val="40"/>
+        </w:rPr>
+        <w:lastRenderedPageBreak/>
+        <w:t>Diseño Centrado en el Usuario (DCU) y Estándares</w:t>
+      </w:r>
+    </w:p>
+    <w:p>
+      <w:pPr>
+        <w:rPr>
+          <w:b/>
+          <w:bCs/>
+          <w:sz w:val="28"/>
+          <w:szCs w:val="28"/>
+        </w:rPr>
+      </w:pPr>
+      <w:r>
+        <w:rPr>
+          <w:b/>
+          <w:bCs/>
+          <w:sz w:val="28"/>
+          <w:szCs w:val="28"/>
+        </w:rPr>
+        <w:t>1.</w:t>
+      </w:r>
+      <w:r>
+        <w:rPr>
+          <w:b/>
+          <w:bCs/>
+          <w:sz w:val="28"/>
+          <w:szCs w:val="28"/>
+        </w:rPr>
+        <w:t>Diseño Centrado en el Usuario (DCU)</w:t>
+      </w:r>
+    </w:p>
+    <w:p>
+      <w:pPr>
+        <w:numPr>
+          <w:ilvl w:val="0"/>
+          <w:numId w:val="2"/>
+        </w:numPr>
+      </w:pPr>
+      <w:r>
+        <w:t xml:space="preserve">¿Qué es?: El Diseño Centrado en el Usuario (DCU), o </w:t>
+      </w:r>
+      <w:proofErr w:type="spellStart"/>
+      <w:r>
+        <w:rPr>
+          <w:i/>
+          <w:iCs/>
+        </w:rPr>
+        <w:t>User-Centered</w:t>
+      </w:r>
+      <w:proofErr w:type="spellEnd"/>
+      <w:r>
+        <w:rPr>
+          <w:i/>
+          <w:iCs/>
+        </w:rPr>
+        <w:t xml:space="preserve"> </w:t>
+      </w:r>
+      <w:proofErr w:type="spellStart"/>
+      <w:r>
+        <w:rPr>
+          <w:i/>
+          <w:iCs/>
+        </w:rPr>
+        <w:t>Design</w:t>
+      </w:r>
+      <w:proofErr w:type="spellEnd"/>
+      <w:r>
+        <w:rPr>
+          <w:i/>
+          <w:iCs/>
+        </w:rPr>
+        <w:t xml:space="preserve"> (UCD)</w:t>
+      </w:r>
+      <w:r>
+        <w:t>, es un enfoque filosófico y metodológico de desarrollo de software y sistemas interactivos que coloca las necesidades, características, capacidades y limitaciones del usuario final en el centro de todo el proceso de diseño y desarrollo.</w:t>
+      </w:r>
+    </w:p>
+    <w:p>
+      <w:pPr>
+        <w:numPr>
+          <w:ilvl w:val="0"/>
+          <w:numId w:val="2"/>
+        </w:numPr>
+      </w:pPr>
+      <w:r>
+        <w:t xml:space="preserve">Propósito principal: En lugar de </w:t>
+      </w:r>
+      <w:r>
+        <w:t>hacer q el usuario sea obligado</w:t>
+      </w:r>
+      <w:r>
+        <w:t xml:space="preserve"> </w:t>
+      </w:r>
+      <w:r>
+        <w:t xml:space="preserve">al usuario a adaptarse al sistema, el DCU busca que el sistema se adapte al usuario, maximizando </w:t>
+      </w:r>
+      <w:r>
+        <w:t>el uso</w:t>
+      </w:r>
+      <w:r>
+        <w:t>, la accesibilidad y la satisfacción. Implica involucrar activamente a los usuarios a lo largo del ciclo de vida del proyecto.</w:t>
+      </w:r>
+    </w:p>
+    <w:p>
+      <w:pPr>
+        <w:rPr>
+          <w:b/>
+          <w:bCs/>
+          <w:sz w:val="28"/>
+          <w:szCs w:val="28"/>
+        </w:rPr>
+      </w:pPr>
+      <w:r>
+        <w:rPr>
+          <w:b/>
+          <w:bCs/>
+          <w:sz w:val="28"/>
+          <w:szCs w:val="28"/>
+        </w:rPr>
+        <w:t>2. Componentes del DCU</w:t>
+      </w:r>
+    </w:p>
+    <w:p>
+      <w:r>
+        <w:t>Para aplicar correctamente el DCU, se deben considerar tres componentes fundamentales:</w:t>
+      </w:r>
+    </w:p>
+    <w:p>
+      <w:pPr>
+        <w:numPr>
+          <w:ilvl w:val="0"/>
+          <w:numId w:val="3"/>
+        </w:numPr>
+      </w:pPr>
+      <w:r>
+        <w:t xml:space="preserve">Contexto de uso: Define </w:t>
+      </w:r>
+      <w:r>
+        <w:rPr>
+          <w:i/>
+          <w:iCs/>
+        </w:rPr>
+        <w:t>quién</w:t>
+      </w:r>
+      <w:r>
+        <w:t xml:space="preserve"> va a usar el producto, </w:t>
+      </w:r>
+      <w:r>
+        <w:rPr>
+          <w:i/>
+          <w:iCs/>
+        </w:rPr>
+        <w:t>para qué</w:t>
+      </w:r>
+      <w:r>
+        <w:t xml:space="preserve"> lo va a usar y </w:t>
+      </w:r>
+      <w:r>
+        <w:rPr>
+          <w:i/>
+          <w:iCs/>
+        </w:rPr>
+        <w:t>en qué entorno</w:t>
+      </w:r>
+      <w:r>
+        <w:t xml:space="preserve"> o condiciones físicas y sociales lo utilizará. Esto incluye:</w:t>
+      </w:r>
+    </w:p>
+    <w:p>
+      <w:pPr>
+        <w:numPr>
+          <w:ilvl w:val="1"/>
+          <w:numId w:val="3"/>
+        </w:numPr>
+      </w:pPr>
+      <w:r>
+        <w:t>Las características de los usuarios (</w:t>
+      </w:r>
+      <w:proofErr w:type="gramStart"/>
+      <w:r>
+        <w:t xml:space="preserve">nivel </w:t>
+      </w:r>
+      <w:r>
+        <w:t xml:space="preserve"> </w:t>
+      </w:r>
+      <w:r>
+        <w:t>académico</w:t>
+      </w:r>
+      <w:proofErr w:type="gramEnd"/>
+      <w:r>
+        <w:t>, edad, habilidades, etc.).</w:t>
+      </w:r>
+    </w:p>
+    <w:p>
+      <w:pPr>
+        <w:numPr>
+          <w:ilvl w:val="1"/>
+          <w:numId w:val="3"/>
+        </w:numPr>
+      </w:pPr>
+      <w:r>
+        <w:t>Las tareas que necesitan realizar.</w:t>
+      </w:r>
+    </w:p>
+    <w:p>
+      <w:pPr>
+        <w:numPr>
+          <w:ilvl w:val="1"/>
+          <w:numId w:val="3"/>
+        </w:numPr>
+      </w:pPr>
+      <w:r>
+        <w:t>El entorno de trabajo o uso (dispositivos, iluminación, movilidad, etc.).</w:t>
+      </w:r>
+    </w:p>
+    <w:p>
+      <w:pPr>
+        <w:numPr>
+          <w:ilvl w:val="0"/>
+          <w:numId w:val="3"/>
+        </w:numPr>
+      </w:pPr>
+      <w:r>
+        <w:t>Requisitos del usuario: Son las necesidades específicas que el sistema debe satisfacer desde la perspectiva del usuario para alcanzar sus objetivos. Estos requisitos se obtienen mediante técnicas de investigación y análisis, y sirven como especificaciones de diseño.</w:t>
+      </w:r>
+    </w:p>
+    <w:p>
+      <w:pPr>
+        <w:numPr>
+          <w:ilvl w:val="0"/>
+          <w:numId w:val="3"/>
+        </w:numPr>
+      </w:pPr>
+      <w:r>
+        <w:t>Criterios de diseño: Son los lineamientos, principios y estándares de usabilidad y accesibilidad que guían a los diseñadores y desarrolladores para asegurar que la interfaz cumpla con los requisitos del usuario de manera eficiente, intuitiva y estéticamente coherente.</w:t>
+      </w:r>
+    </w:p>
+    <w:p>
+      <w:pPr>
+        <w:rPr>
+          <w:b/>
+          <w:bCs/>
+          <w:sz w:val="28"/>
+          <w:szCs w:val="28"/>
+        </w:rPr>
+      </w:pPr>
+      <w:r>
+        <w:rPr>
+          <w:b/>
+          <w:bCs/>
+          <w:sz w:val="28"/>
+          <w:szCs w:val="28"/>
+        </w:rPr>
+        <w:t>3. Norma ISO 13407 y su aplicación en el desarrollo de interfaces</w:t>
+      </w:r>
+    </w:p>
+    <w:p>
+      <w:pPr>
+        <w:numPr>
+          <w:ilvl w:val="0"/>
+          <w:numId w:val="4"/>
+        </w:numPr>
+      </w:pPr>
+      <w:r>
+        <w:t xml:space="preserve">¿Qué es la Norma ISO 13407?: Es el estándar internacional (titulado </w:t>
+      </w:r>
+      <w:r>
+        <w:rPr>
+          <w:i/>
+          <w:iCs/>
+        </w:rPr>
+        <w:t>"Human-</w:t>
+      </w:r>
+      <w:proofErr w:type="spellStart"/>
+      <w:r>
+        <w:rPr>
+          <w:i/>
+          <w:iCs/>
+        </w:rPr>
+        <w:t>centred</w:t>
+      </w:r>
+      <w:proofErr w:type="spellEnd"/>
+      <w:r>
+        <w:rPr>
+          <w:i/>
+          <w:iCs/>
+        </w:rPr>
+        <w:t xml:space="preserve"> </w:t>
+      </w:r>
+      <w:proofErr w:type="spellStart"/>
+      <w:r>
+        <w:rPr>
+          <w:i/>
+          <w:iCs/>
+        </w:rPr>
+        <w:t>design</w:t>
+      </w:r>
+      <w:proofErr w:type="spellEnd"/>
+      <w:r>
+        <w:rPr>
+          <w:i/>
+          <w:iCs/>
+        </w:rPr>
+        <w:t xml:space="preserve"> </w:t>
+      </w:r>
+      <w:proofErr w:type="spellStart"/>
+      <w:r>
+        <w:rPr>
+          <w:i/>
+          <w:iCs/>
+        </w:rPr>
+        <w:t>processes</w:t>
+      </w:r>
+      <w:proofErr w:type="spellEnd"/>
+      <w:r>
+        <w:rPr>
+          <w:i/>
+          <w:iCs/>
+        </w:rPr>
+        <w:t xml:space="preserve"> </w:t>
+      </w:r>
+      <w:proofErr w:type="spellStart"/>
+      <w:r>
+        <w:rPr>
+          <w:i/>
+          <w:iCs/>
+        </w:rPr>
+        <w:t>for</w:t>
+      </w:r>
+      <w:proofErr w:type="spellEnd"/>
+      <w:r>
+        <w:rPr>
+          <w:i/>
+          <w:iCs/>
+        </w:rPr>
+        <w:t xml:space="preserve"> interactive </w:t>
+      </w:r>
+      <w:proofErr w:type="spellStart"/>
+      <w:r>
+        <w:rPr>
+          <w:i/>
+          <w:iCs/>
+        </w:rPr>
+        <w:t>systems</w:t>
+      </w:r>
+      <w:proofErr w:type="spellEnd"/>
+      <w:r>
+        <w:rPr>
+          <w:i/>
+          <w:iCs/>
+        </w:rPr>
+        <w:t>"</w:t>
+      </w:r>
+      <w:r>
+        <w:t>) que proporciona una guía sobre los procesos de diseño centrado en el humano en los sistemas interactivos.</w:t>
+      </w:r>
+    </w:p>
+    <w:p>
+      <w:pPr>
+        <w:numPr>
+          <w:ilvl w:val="0"/>
+          <w:numId w:val="4"/>
+        </w:numPr>
+      </w:pPr>
+      <w:r>
+        <w:t>Principios clave de la norma:</w:t>
+      </w:r>
+    </w:p>
+    <w:p>
+      <w:pPr>
+        <w:numPr>
+          <w:ilvl w:val="1"/>
+          <w:numId w:val="4"/>
+        </w:numPr>
+      </w:pPr>
+      <w:r>
+        <w:t xml:space="preserve">La </w:t>
+      </w:r>
+      <w:proofErr w:type="gramStart"/>
+      <w:r>
+        <w:t>participación activa</w:t>
+      </w:r>
+      <w:proofErr w:type="gramEnd"/>
+      <w:r>
+        <w:t xml:space="preserve"> de los usuarios y una clara comprensión de los requisitos de usuario y de tarea.</w:t>
+      </w:r>
+    </w:p>
+    <w:p>
+      <w:pPr>
+        <w:numPr>
+          <w:ilvl w:val="1"/>
+          <w:numId w:val="4"/>
+        </w:numPr>
+      </w:pPr>
+      <w:r>
+        <w:t>La asignación adecuada de funciones entre el usuario y la tecnología.</w:t>
+      </w:r>
+    </w:p>
+    <w:p>
+      <w:pPr>
+        <w:numPr>
+          <w:ilvl w:val="1"/>
+          <w:numId w:val="4"/>
+        </w:numPr>
+      </w:pPr>
+      <w:r>
+        <w:t>El diseño iterativo (probar, evaluar y corregir de manera constante).</w:t>
+      </w:r>
+    </w:p>
+    <w:p>
+      <w:pPr>
+        <w:numPr>
+          <w:ilvl w:val="1"/>
+          <w:numId w:val="4"/>
+        </w:numPr>
+      </w:pPr>
+      <w:r>
+        <w:lastRenderedPageBreak/>
+        <w:t>El diseño multidisciplinario (integrar expertos en diseño, desarrollo, psicología, etc.).</w:t>
+      </w:r>
+    </w:p>
+    <w:p>
+      <w:pPr>
+        <w:numPr>
+          <w:ilvl w:val="0"/>
+          <w:numId w:val="4"/>
+        </w:numPr>
+        <w:rPr>
+          <w:b/>
+          <w:bCs/>
+        </w:rPr>
+      </w:pPr>
+      <w:r>
+        <w:t>Aplicación en el desarrollo de interfaces: Su aplicación garantiza que el desarrollo de interfaces no se base en suposiciones subjetivas del equipo de desarrollo, sino en un proceso estructurado, repetible y enfocado en la experiencia real de quien operará el software o sitio web.</w:t>
+      </w:r>
+      <w:r>
+        <w:br/>
+      </w:r>
+    </w:p>
+    <w:p>
+      <w:pPr>
+        <w:rPr>
+          <w:b/>
+          <w:bCs/>
+          <w:sz w:val="40"/>
+          <w:szCs w:val="40"/>
+        </w:rPr>
+      </w:pPr>
+    </w:p>
     <w:sectPr>
       <w:pgSz w:w="12240" w:h="15840"/>
       <w:pgMar w:top="1417" w:right="1701" w:bottom="1417" w:left="1701" w:header="708" w:footer="708" w:gutter="0"/>
@@ -1307,8 +1806,306 @@
 </file>
 
 <file path=word/numbering.xml><?xml version="1.0" encoding="utf-8"?>
-<w:numbering xmlns:wpc="http://schemas.microsoft.com/office/word/2010/wordprocessingCanvas" xmlns:cx="http://schemas.microsoft.com/office/drawing/2014/chartex" xmlns:cx1="http://schemas.microsoft.com/office/drawing/2015/9/8/chartex" xmlns:cx2="http://schemas.microsoft.com/office/drawing/2015/10/21/chartex" xmlns:cx3="http://schemas.microsoft.com/office/drawing/2016/5/9/chartex" xmlns:cx4="http://schemas.microsoft.com/office/drawing/2016/5/10/chartex" xmlns:cx5="http://schemas.microsoft.com/office/drawing/2016/5/11/chartex" xmlns:cx6="http://schemas.microsoft.com/office/drawing/2016/5/12/chartex" xmlns:cx7="http://schemas.microsoft.com/office/drawing/2016/5/13/chartex" xmlns:cx8="http://schemas.microsoft.com/office/drawing/2016/5/14/chartex" xmlns:mc="http://schemas.openxmlformats.org/markup-compatibility/2006" xmlns:aink="http://schemas.microsoft.com/office/drawing/2016/ink" xmlns:am3d="http://schemas.microsoft.com/office/drawing/2017/model3d" xmlns:o="urn:schemas-microsoft-com:office:office" xmlns:oel="http://schemas.microsoft.com/office/2019/extlst" xmlns:r="http://schemas.openxmlformats.org/officeDocument/2006/relationships" xmlns:m="http://schemas.openxmlformats.org/officeDocument/2006/math" xmlns:v="urn:schemas-microsoft-com:vml" xmlns:wp14="http://schemas.microsoft.com/office/word/2010/wordprocessingDrawing" xmlns:wp="http://schemas.openxmlformats.org/drawingml/2006/wordprocessingDrawing" xmlns:w10="urn:schemas-microsoft-com:office:word" xmlns:w="http://schemas.openxmlformats.org/wordprocessingml/2006/main" xmlns:w14="http://schemas.microsoft.com/office/word/2010/wordml" xmlns:w15="http://schemas.microsoft.com/office/word/2012/wordml" xmlns:w16cex="http://schemas.microsoft.com/office/word/2018/wordml/cex" xmlns:w16cid="http://schemas.microsoft.com/office/word/2016/wordml/cid" xmlns:w16="http://schemas.microsoft.com/office/word/2018/wordml" xmlns:w16du="http://schemas.microsoft.com/office/word/2023/wordml/word16du" xmlns:w16sdtdh="http://schemas.microsoft.com/office/word/2020/wordml/sdtdatahash" xmlns:w16se="http://schemas.microsoft.com/office/word/2015/wordml/symex" xmlns:wpg="http://schemas.microsoft.com/office/word/2010/wordprocessingGroup" xmlns:wpi="http://schemas.microsoft.com/office/word/2010/wordprocessingInk" xmlns:wne="http://schemas.microsoft.com/office/word/2006/wordml" xmlns:wps="http://schemas.microsoft.com/office/word/2010/wordprocessingShape" mc:Ignorable="w14 w15 w16se w16cid w16 w16cex w16sdtdh w16du wp14">
+<w:numbering xmlns:wpc="http://schemas.microsoft.com/office/word/2010/wordprocessingCanvas" xmlns:cx="http://schemas.microsoft.com/office/drawing/2014/chartex" xmlns:cx1="http://schemas.microsoft.com/office/drawing/2015/9/8/chartex" xmlns:cx2="http://schemas.microsoft.com/office/drawing/2015/10/21/chartex" xmlns:cx3="http://schemas.microsoft.com/office/drawing/2016/5/9/chartex" xmlns:cx4="http://schemas.microsoft.com/office/drawing/2016/5/10/chartex" xmlns:cx5="http://schemas.microsoft.com/office/drawing/2016/5/11/chartex" xmlns:cx6="http://schemas.microsoft.com/office/drawing/2016/5/12/chartex" xmlns:cx7="http://schemas.microsoft.com/office/drawing/2016/5/13/chartex" xmlns:cx8="http://schemas.microsoft.com/office/drawing/2016/5/14/chartex" xmlns:mc="http://schemas.openxmlformats.org/markup-compatibility/2006" xmlns:aink="http://schemas.microsoft.com/office/drawing/2016/ink" xmlns:am3d="http://schemas.microsoft.com/office/drawing/2017/model3d" xmlns:o="urn:schemas-microsoft-com:office:office" xmlns:oel="http://schemas.microsoft.com/office/2019/extlst" xmlns:r="http://schemas.openxmlformats.org/officeDocument/2006/relationships" xmlns:m="http://schemas.openxmlformats.org/officeDocument/2006/math" xmlns:v="urn:schemas-microsoft-com:vml" xmlns:wp14="http://schemas.microsoft.com/office/word/2010/wordprocessingDrawing" xmlns:wp="http://schemas.openxmlformats.org/drawingml/2006/wordprocessingDrawing" xmlns:w10="urn:schemas-microsoft-com:office:word" xmlns:w="http://schemas.openxmlformats.org/wordprocessingml/2006/main" xmlns:w14="http://schemas.microsoft.com/office/word/2010/wordml" xmlns:w15="http://schemas.microsoft.com/office/word/2012/wordml" xmlns:w16cex="http://schemas.microsoft.com/office/word/2018/wordml/cex" xmlns:w16cid="http://schemas.microsoft.com/office/word/2016/wordml/cid" xmlns:w16="http://schemas.microsoft.com/office/word/2018/wordml" xmlns:w16du="http://schemas.microsoft.com/office/word/2023/wordml/word16du" xmlns:w16sdtdh="http://schemas.microsoft.com/office/word/2020/wordml/sdtdatahash" xmlns:w16sdtfl="http://schemas.microsoft.com/office/word/2024/wordml/sdtformatlock" xmlns:w16se="http://schemas.microsoft.com/office/word/2015/wordml/symex" xmlns:wpg="http://schemas.microsoft.com/office/word/2010/wordprocessingGroup" xmlns:wpi="http://schemas.microsoft.com/office/word/2010/wordprocessingInk" xmlns:wne="http://schemas.microsoft.com/office/word/2006/wordml" xmlns:wps="http://schemas.microsoft.com/office/word/2010/wordprocessingShape" mc:Ignorable="w14 w15 w16se w16cid w16 w16cex w16sdtdh w16sdtfl w16du wp14">
   <w:abstractNum w:abstractNumId="0" w15:restartNumberingAfterBreak="0">
+    <w:nsid w:val="23883E91"/>
+    <w:multiLevelType w:val="multilevel"/>
+    <w:tmpl w:val="0FEAD830"/>
+    <w:lvl w:ilvl="0">
+      <w:start w:val="1"/>
+      <w:numFmt w:val="bullet"/>
+      <w:lvlText w:val=""/>
+      <w:lvlJc w:val="left"/>
+      <w:pPr>
+        <w:tabs>
+          <w:tab w:val="num" w:pos="720"/>
+        </w:tabs>
+        <w:ind w:left="720" w:hanging="360"/>
+      </w:pPr>
+      <w:rPr>
+        <w:rFonts w:ascii="Symbol" w:hAnsi="Symbol" w:hint="default"/>
+        <w:sz w:val="20"/>
+      </w:rPr>
+    </w:lvl>
+    <w:lvl w:ilvl="1">
+      <w:start w:val="1"/>
+      <w:numFmt w:val="bullet"/>
+      <w:lvlText w:val="o"/>
+      <w:lvlJc w:val="left"/>
+      <w:pPr>
+        <w:tabs>
+          <w:tab w:val="num" w:pos="1440"/>
+        </w:tabs>
+        <w:ind w:left="1440" w:hanging="360"/>
+      </w:pPr>
+      <w:rPr>
+        <w:rFonts w:ascii="Courier New" w:hAnsi="Courier New" w:hint="default"/>
+        <w:sz w:val="20"/>
+      </w:rPr>
+    </w:lvl>
+    <w:lvl w:ilvl="2" w:tentative="1">
+      <w:start w:val="1"/>
+      <w:numFmt w:val="bullet"/>
+      <w:lvlText w:val=""/>
+      <w:lvlJc w:val="left"/>
+      <w:pPr>
+        <w:tabs>
+          <w:tab w:val="num" w:pos="2160"/>
+        </w:tabs>
+        <w:ind w:left="2160" w:hanging="360"/>
+      </w:pPr>
+      <w:rPr>
+        <w:rFonts w:ascii="Wingdings" w:hAnsi="Wingdings" w:hint="default"/>
+        <w:sz w:val="20"/>
+      </w:rPr>
+    </w:lvl>
+    <w:lvl w:ilvl="3" w:tentative="1">
+      <w:start w:val="1"/>
+      <w:numFmt w:val="bullet"/>
+      <w:lvlText w:val=""/>
+      <w:lvlJc w:val="left"/>
+      <w:pPr>
+        <w:tabs>
+          <w:tab w:val="num" w:pos="2880"/>
+        </w:tabs>
+        <w:ind w:left="2880" w:hanging="360"/>
+      </w:pPr>
+      <w:rPr>
+        <w:rFonts w:ascii="Wingdings" w:hAnsi="Wingdings" w:hint="default"/>
+        <w:sz w:val="20"/>
+      </w:rPr>
+    </w:lvl>
+    <w:lvl w:ilvl="4" w:tentative="1">
+      <w:start w:val="1"/>
+      <w:numFmt w:val="bullet"/>
+      <w:lvlText w:val=""/>
+      <w:lvlJc w:val="left"/>
+      <w:pPr>
+        <w:tabs>
+          <w:tab w:val="num" w:pos="3600"/>
+        </w:tabs>
+        <w:ind w:left="3600" w:hanging="360"/>
+      </w:pPr>
+      <w:rPr>
+        <w:rFonts w:ascii="Wingdings" w:hAnsi="Wingdings" w:hint="default"/>
+        <w:sz w:val="20"/>
+      </w:rPr>
+    </w:lvl>
+    <w:lvl w:ilvl="5" w:tentative="1">
+      <w:start w:val="1"/>
+      <w:numFmt w:val="bullet"/>
+      <w:lvlText w:val=""/>
+      <w:lvlJc w:val="left"/>
+      <w:pPr>
+        <w:tabs>
+          <w:tab w:val="num" w:pos="4320"/>
+        </w:tabs>
+        <w:ind w:left="4320" w:hanging="360"/>
+      </w:pPr>
+      <w:rPr>
+        <w:rFonts w:ascii="Wingdings" w:hAnsi="Wingdings" w:hint="default"/>
+        <w:sz w:val="20"/>
+      </w:rPr>
+    </w:lvl>
+    <w:lvl w:ilvl="6" w:tentative="1">
+      <w:start w:val="1"/>
+      <w:numFmt w:val="bullet"/>
+      <w:lvlText w:val=""/>
+      <w:lvlJc w:val="left"/>
+      <w:pPr>
+        <w:tabs>
+          <w:tab w:val="num" w:pos="5040"/>
+        </w:tabs>
+        <w:ind w:left="5040" w:hanging="360"/>
+      </w:pPr>
+      <w:rPr>
+        <w:rFonts w:ascii="Wingdings" w:hAnsi="Wingdings" w:hint="default"/>
+        <w:sz w:val="20"/>
+      </w:rPr>
+    </w:lvl>
+    <w:lvl w:ilvl="7" w:tentative="1">
+      <w:start w:val="1"/>
+      <w:numFmt w:val="bullet"/>
+      <w:lvlText w:val=""/>
+      <w:lvlJc w:val="left"/>
+      <w:pPr>
+        <w:tabs>
+          <w:tab w:val="num" w:pos="5760"/>
+        </w:tabs>
+        <w:ind w:left="5760" w:hanging="360"/>
+      </w:pPr>
+      <w:rPr>
+        <w:rFonts w:ascii="Wingdings" w:hAnsi="Wingdings" w:hint="default"/>
+        <w:sz w:val="20"/>
+      </w:rPr>
+    </w:lvl>
+    <w:lvl w:ilvl="8" w:tentative="1">
+      <w:start w:val="1"/>
+      <w:numFmt w:val="bullet"/>
+      <w:lvlText w:val=""/>
+      <w:lvlJc w:val="left"/>
+      <w:pPr>
+        <w:tabs>
+          <w:tab w:val="num" w:pos="6480"/>
+        </w:tabs>
+        <w:ind w:left="6480" w:hanging="360"/>
+      </w:pPr>
+      <w:rPr>
+        <w:rFonts w:ascii="Wingdings" w:hAnsi="Wingdings" w:hint="default"/>
+        <w:sz w:val="20"/>
+      </w:rPr>
+    </w:lvl>
+  </w:abstractNum>
+  <w:abstractNum w:abstractNumId="1" w15:restartNumberingAfterBreak="0">
+    <w:nsid w:val="4A974699"/>
+    <w:multiLevelType w:val="multilevel"/>
+    <w:tmpl w:val="6076FAEA"/>
+    <w:lvl w:ilvl="0">
+      <w:start w:val="1"/>
+      <w:numFmt w:val="bullet"/>
+      <w:lvlText w:val=""/>
+      <w:lvlJc w:val="left"/>
+      <w:pPr>
+        <w:tabs>
+          <w:tab w:val="num" w:pos="720"/>
+        </w:tabs>
+        <w:ind w:left="720" w:hanging="360"/>
+      </w:pPr>
+      <w:rPr>
+        <w:rFonts w:ascii="Symbol" w:hAnsi="Symbol" w:hint="default"/>
+        <w:sz w:val="20"/>
+      </w:rPr>
+    </w:lvl>
+    <w:lvl w:ilvl="1">
+      <w:start w:val="1"/>
+      <w:numFmt w:val="bullet"/>
+      <w:lvlText w:val="o"/>
+      <w:lvlJc w:val="left"/>
+      <w:pPr>
+        <w:tabs>
+          <w:tab w:val="num" w:pos="1440"/>
+        </w:tabs>
+        <w:ind w:left="1440" w:hanging="360"/>
+      </w:pPr>
+      <w:rPr>
+        <w:rFonts w:ascii="Courier New" w:hAnsi="Courier New" w:hint="default"/>
+        <w:sz w:val="20"/>
+      </w:rPr>
+    </w:lvl>
+    <w:lvl w:ilvl="2" w:tentative="1">
+      <w:start w:val="1"/>
+      <w:numFmt w:val="bullet"/>
+      <w:lvlText w:val=""/>
+      <w:lvlJc w:val="left"/>
+      <w:pPr>
+        <w:tabs>
+          <w:tab w:val="num" w:pos="2160"/>
+        </w:tabs>
+        <w:ind w:left="2160" w:hanging="360"/>
+      </w:pPr>
+      <w:rPr>
+        <w:rFonts w:ascii="Wingdings" w:hAnsi="Wingdings" w:hint="default"/>
+        <w:sz w:val="20"/>
+      </w:rPr>
+    </w:lvl>
+    <w:lvl w:ilvl="3" w:tentative="1">
+      <w:start w:val="1"/>
+      <w:numFmt w:val="bullet"/>
+      <w:lvlText w:val=""/>
+      <w:lvlJc w:val="left"/>
+      <w:pPr>
+        <w:tabs>
+          <w:tab w:val="num" w:pos="2880"/>
+        </w:tabs>
+        <w:ind w:left="2880" w:hanging="360"/>
+      </w:pPr>
+      <w:rPr>
+        <w:rFonts w:ascii="Wingdings" w:hAnsi="Wingdings" w:hint="default"/>
+        <w:sz w:val="20"/>
+      </w:rPr>
+    </w:lvl>
+    <w:lvl w:ilvl="4" w:tentative="1">
+      <w:start w:val="1"/>
+      <w:numFmt w:val="bullet"/>
+      <w:lvlText w:val=""/>
+      <w:lvlJc w:val="left"/>
+      <w:pPr>
+        <w:tabs>
+          <w:tab w:val="num" w:pos="3600"/>
+        </w:tabs>
+        <w:ind w:left="3600" w:hanging="360"/>
+      </w:pPr>
+      <w:rPr>
+        <w:rFonts w:ascii="Wingdings" w:hAnsi="Wingdings" w:hint="default"/>
+        <w:sz w:val="20"/>
+      </w:rPr>
+    </w:lvl>
+    <w:lvl w:ilvl="5" w:tentative="1">
+      <w:start w:val="1"/>
+      <w:numFmt w:val="bullet"/>
+      <w:lvlText w:val=""/>
+      <w:lvlJc w:val="left"/>
+      <w:pPr>
+        <w:tabs>
+          <w:tab w:val="num" w:pos="4320"/>
+        </w:tabs>
+        <w:ind w:left="4320" w:hanging="360"/>
+      </w:pPr>
+      <w:rPr>
+        <w:rFonts w:ascii="Wingdings" w:hAnsi="Wingdings" w:hint="default"/>
+        <w:sz w:val="20"/>
+      </w:rPr>
+    </w:lvl>
+    <w:lvl w:ilvl="6" w:tentative="1">
+      <w:start w:val="1"/>
+      <w:numFmt w:val="bullet"/>
+      <w:lvlText w:val=""/>
+      <w:lvlJc w:val="left"/>
+      <w:pPr>
+        <w:tabs>
+          <w:tab w:val="num" w:pos="5040"/>
+        </w:tabs>
+        <w:ind w:left="5040" w:hanging="360"/>
+      </w:pPr>
+      <w:rPr>
+        <w:rFonts w:ascii="Wingdings" w:hAnsi="Wingdings" w:hint="default"/>
+        <w:sz w:val="20"/>
+      </w:rPr>
+    </w:lvl>
+    <w:lvl w:ilvl="7" w:tentative="1">
+      <w:start w:val="1"/>
+      <w:numFmt w:val="bullet"/>
+      <w:lvlText w:val=""/>
+      <w:lvlJc w:val="left"/>
+      <w:pPr>
+        <w:tabs>
+          <w:tab w:val="num" w:pos="5760"/>
+        </w:tabs>
+        <w:ind w:left="5760" w:hanging="360"/>
+      </w:pPr>
+      <w:rPr>
+        <w:rFonts w:ascii="Wingdings" w:hAnsi="Wingdings" w:hint="default"/>
+        <w:sz w:val="20"/>
+      </w:rPr>
+    </w:lvl>
+    <w:lvl w:ilvl="8" w:tentative="1">
+      <w:start w:val="1"/>
+      <w:numFmt w:val="bullet"/>
+      <w:lvlText w:val=""/>
+      <w:lvlJc w:val="left"/>
+      <w:pPr>
+        <w:tabs>
+          <w:tab w:val="num" w:pos="6480"/>
+        </w:tabs>
+        <w:ind w:left="6480" w:hanging="360"/>
+      </w:pPr>
+      <w:rPr>
+        <w:rFonts w:ascii="Wingdings" w:hAnsi="Wingdings" w:hint="default"/>
+        <w:sz w:val="20"/>
+      </w:rPr>
+    </w:lvl>
+  </w:abstractNum>
+  <w:abstractNum w:abstractNumId="2" w15:restartNumberingAfterBreak="0">
     <w:nsid w:val="7793268A"/>
     <w:multiLevelType w:val="multilevel"/>
     <w:tmpl w:val="7AFCACDC"/>
@@ -1457,14 +2254,172 @@
       </w:rPr>
     </w:lvl>
   </w:abstractNum>
+  <w:abstractNum w:abstractNumId="3" w15:restartNumberingAfterBreak="0">
+    <w:nsid w:val="787A339E"/>
+    <w:multiLevelType w:val="multilevel"/>
+    <w:tmpl w:val="DFA413A2"/>
+    <w:lvl w:ilvl="0">
+      <w:start w:val="1"/>
+      <w:numFmt w:val="bullet"/>
+      <w:lvlText w:val=""/>
+      <w:lvlJc w:val="left"/>
+      <w:pPr>
+        <w:tabs>
+          <w:tab w:val="num" w:pos="720"/>
+        </w:tabs>
+        <w:ind w:left="720" w:hanging="360"/>
+      </w:pPr>
+      <w:rPr>
+        <w:rFonts w:ascii="Symbol" w:hAnsi="Symbol" w:hint="default"/>
+        <w:sz w:val="20"/>
+      </w:rPr>
+    </w:lvl>
+    <w:lvl w:ilvl="1" w:tentative="1">
+      <w:start w:val="1"/>
+      <w:numFmt w:val="bullet"/>
+      <w:lvlText w:val="o"/>
+      <w:lvlJc w:val="left"/>
+      <w:pPr>
+        <w:tabs>
+          <w:tab w:val="num" w:pos="1440"/>
+        </w:tabs>
+        <w:ind w:left="1440" w:hanging="360"/>
+      </w:pPr>
+      <w:rPr>
+        <w:rFonts w:ascii="Courier New" w:hAnsi="Courier New" w:hint="default"/>
+        <w:sz w:val="20"/>
+      </w:rPr>
+    </w:lvl>
+    <w:lvl w:ilvl="2" w:tentative="1">
+      <w:start w:val="1"/>
+      <w:numFmt w:val="bullet"/>
+      <w:lvlText w:val=""/>
+      <w:lvlJc w:val="left"/>
+      <w:pPr>
+        <w:tabs>
+          <w:tab w:val="num" w:pos="2160"/>
+        </w:tabs>
+        <w:ind w:left="2160" w:hanging="360"/>
+      </w:pPr>
+      <w:rPr>
+        <w:rFonts w:ascii="Wingdings" w:hAnsi="Wingdings" w:hint="default"/>
+        <w:sz w:val="20"/>
+      </w:rPr>
+    </w:lvl>
+    <w:lvl w:ilvl="3" w:tentative="1">
+      <w:start w:val="1"/>
+      <w:numFmt w:val="bullet"/>
+      <w:lvlText w:val=""/>
+      <w:lvlJc w:val="left"/>
+      <w:pPr>
+        <w:tabs>
+          <w:tab w:val="num" w:pos="2880"/>
+        </w:tabs>
+        <w:ind w:left="2880" w:hanging="360"/>
+      </w:pPr>
+      <w:rPr>
+        <w:rFonts w:ascii="Wingdings" w:hAnsi="Wingdings" w:hint="default"/>
+        <w:sz w:val="20"/>
+      </w:rPr>
+    </w:lvl>
+    <w:lvl w:ilvl="4" w:tentative="1">
+      <w:start w:val="1"/>
+      <w:numFmt w:val="bullet"/>
+      <w:lvlText w:val=""/>
+      <w:lvlJc w:val="left"/>
+      <w:pPr>
+        <w:tabs>
+          <w:tab w:val="num" w:pos="3600"/>
+        </w:tabs>
+        <w:ind w:left="3600" w:hanging="360"/>
+      </w:pPr>
+      <w:rPr>
+        <w:rFonts w:ascii="Wingdings" w:hAnsi="Wingdings" w:hint="default"/>
+        <w:sz w:val="20"/>
+      </w:rPr>
+    </w:lvl>
+    <w:lvl w:ilvl="5" w:tentative="1">
+      <w:start w:val="1"/>
+      <w:numFmt w:val="bullet"/>
+      <w:lvlText w:val=""/>
+      <w:lvlJc w:val="left"/>
+      <w:pPr>
+        <w:tabs>
+          <w:tab w:val="num" w:pos="4320"/>
+        </w:tabs>
+        <w:ind w:left="4320" w:hanging="360"/>
+      </w:pPr>
+      <w:rPr>
+        <w:rFonts w:ascii="Wingdings" w:hAnsi="Wingdings" w:hint="default"/>
+        <w:sz w:val="20"/>
+      </w:rPr>
+    </w:lvl>
+    <w:lvl w:ilvl="6" w:tentative="1">
+      <w:start w:val="1"/>
+      <w:numFmt w:val="bullet"/>
+      <w:lvlText w:val=""/>
+      <w:lvlJc w:val="left"/>
+      <w:pPr>
+        <w:tabs>
+          <w:tab w:val="num" w:pos="5040"/>
+        </w:tabs>
+        <w:ind w:left="5040" w:hanging="360"/>
+      </w:pPr>
+      <w:rPr>
+        <w:rFonts w:ascii="Wingdings" w:hAnsi="Wingdings" w:hint="default"/>
+        <w:sz w:val="20"/>
+      </w:rPr>
+    </w:lvl>
+    <w:lvl w:ilvl="7" w:tentative="1">
+      <w:start w:val="1"/>
+      <w:numFmt w:val="bullet"/>
+      <w:lvlText w:val=""/>
+      <w:lvlJc w:val="left"/>
+      <w:pPr>
+        <w:tabs>
+          <w:tab w:val="num" w:pos="5760"/>
+        </w:tabs>
+        <w:ind w:left="5760" w:hanging="360"/>
+      </w:pPr>
+      <w:rPr>
+        <w:rFonts w:ascii="Wingdings" w:hAnsi="Wingdings" w:hint="default"/>
+        <w:sz w:val="20"/>
+      </w:rPr>
+    </w:lvl>
+    <w:lvl w:ilvl="8" w:tentative="1">
+      <w:start w:val="1"/>
+      <w:numFmt w:val="bullet"/>
+      <w:lvlText w:val=""/>
+      <w:lvlJc w:val="left"/>
+      <w:pPr>
+        <w:tabs>
+          <w:tab w:val="num" w:pos="6480"/>
+        </w:tabs>
+        <w:ind w:left="6480" w:hanging="360"/>
+      </w:pPr>
+      <w:rPr>
+        <w:rFonts w:ascii="Wingdings" w:hAnsi="Wingdings" w:hint="default"/>
+        <w:sz w:val="20"/>
+      </w:rPr>
+    </w:lvl>
+  </w:abstractNum>
   <w:num w:numId="1" w16cid:durableId="1966736855">
+    <w:abstractNumId w:val="2"/>
+  </w:num>
+  <w:num w:numId="2" w16cid:durableId="963001396">
+    <w:abstractNumId w:val="3"/>
+  </w:num>
+  <w:num w:numId="3" w16cid:durableId="917443335">
+    <w:abstractNumId w:val="1"/>
+  </w:num>
+  <w:num w:numId="4" w16cid:durableId="767775470">
     <w:abstractNumId w:val="0"/>
   </w:num>
 </w:numbering>
 </file>
 
 <file path=word/styles.xml><?xml version="1.0" encoding="utf-8"?>
-<w:styles xmlns:mc="http://schemas.openxmlformats.org/markup-compatibility/2006" xmlns:r="http://schemas.openxmlformats.org/officeDocument/2006/relationships" xmlns:w="http://schemas.openxmlformats.org/wordprocessingml/2006/main" xmlns:w14="http://schemas.microsoft.com/office/word/2010/wordml" xmlns:w15="http://schemas.microsoft.com/office/word/2012/wordml" xmlns:w16cex="http://schemas.microsoft.com/office/word/2018/wordml/cex" xmlns:w16cid="http://schemas.microsoft.com/office/word/2016/wordml/cid" xmlns:w16="http://schemas.microsoft.com/office/word/2018/wordml" xmlns:w16du="http://schemas.microsoft.com/office/word/2023/wordml/word16du" xmlns:w16sdtdh="http://schemas.microsoft.com/office/word/2020/wordml/sdtdatahash" xmlns:w16se="http://schemas.microsoft.com/office/word/2015/wordml/symex" mc:Ignorable="w14 w15 w16se w16cid w16 w16cex w16sdtdh w16du">
+<w:styles xmlns:mc="http://schemas.openxmlformats.org/markup-compatibility/2006" xmlns:r="http://schemas.openxmlformats.org/officeDocument/2006/relationships" xmlns:w="http://schemas.openxmlformats.org/wordprocessingml/2006/main" xmlns:w14="http://schemas.microsoft.com/office/word/2010/wordml" xmlns:w15="http://schemas.microsoft.com/office/word/2012/wordml" xmlns:w16cex="http://schemas.microsoft.com/office/word/2018/wordml/cex" xmlns:w16cid="http://schemas.microsoft.com/office/word/2016/wordml/cid" xmlns:w16="http://schemas.microsoft.com/office/word/2018/wordml" xmlns:w16du="http://schemas.microsoft.com/office/word/2023/wordml/word16du" xmlns:w16sdtdh="http://schemas.microsoft.com/office/word/2020/wordml/sdtdatahash" xmlns:w16sdtfl="http://schemas.microsoft.com/office/word/2024/wordml/sdtformatlock" xmlns:w16se="http://schemas.microsoft.com/office/word/2015/wordml/symex" mc:Ignorable="w14 w15 w16se w16cid w16 w16cex w16sdtdh w16sdtfl w16du">
   <w:docDefaults>
     <w:rPrDefault>
       <w:rPr>
@@ -1930,10 +2885,32 @@
       <w14:ligatures w14:val="none"/>
     </w:rPr>
   </w:style>
+  <w:style w:type="paragraph" w:styleId="Ttulo4">
+    <w:name w:val="heading 4"/>
+    <w:basedOn w:val="Normal"/>
+    <w:next w:val="Normal"/>
+    <w:link w:val="Ttulo4Car"/>
+    <w:uiPriority w:val="9"/>
+    <w:semiHidden/>
+    <w:unhideWhenUsed/>
+    <w:qFormat/>
+    <w:rsid w:val="009F4F96"/>
+    <w:pPr>
+      <w:keepNext/>
+      <w:keepLines/>
+      <w:spacing w:before="40" w:after="0"/>
+      <w:outlineLvl w:val="3"/>
+    </w:pPr>
+    <w:rPr>
+      <w:rFonts w:asciiTheme="majorHAnsi" w:eastAsiaTheme="majorEastAsia" w:hAnsiTheme="majorHAnsi" w:cstheme="majorBidi"/>
+      <w:i/>
+      <w:iCs/>
+      <w:color w:val="2F5496" w:themeColor="accent1" w:themeShade="BF"/>
+    </w:rPr>
+  </w:style>
   <w:style w:type="character" w:default="1" w:styleId="Fuentedeprrafopredeter">
     <w:name w:val="Default Paragraph Font"/>
     <w:uiPriority w:val="1"/>
-    <w:semiHidden/>
     <w:unhideWhenUsed/>
   </w:style>
   <w:style w:type="table" w:default="1" w:styleId="Tablanormal">
@@ -2006,6 +2983,20 @@
       <w:szCs w:val="27"/>
       <w:lang w:eastAsia="es-MX"/>
       <w14:ligatures w14:val="none"/>
+    </w:rPr>
+  </w:style>
+  <w:style w:type="character" w:customStyle="1" w:styleId="Ttulo4Car">
+    <w:name w:val="Título 4 Car"/>
+    <w:basedOn w:val="Fuentedeprrafopredeter"/>
+    <w:link w:val="Ttulo4"/>
+    <w:uiPriority w:val="9"/>
+    <w:semiHidden/>
+    <w:rsid w:val="009F4F96"/>
+    <w:rPr>
+      <w:rFonts w:asciiTheme="majorHAnsi" w:eastAsiaTheme="majorEastAsia" w:hAnsiTheme="majorHAnsi" w:cstheme="majorBidi"/>
+      <w:i/>
+      <w:iCs/>
+      <w:color w:val="2F5496" w:themeColor="accent1" w:themeShade="BF"/>
     </w:rPr>
   </w:style>
 </w:styles>

</xml_diff>

<commit_message>
Agregue las etapas y metodos
</commit_message>
<xml_diff>
--- a/Actividad 1 Unidad 2 Usuario/INVESTIACION ACT 1.docx
+++ b/Actividad 1 Unidad 2 Usuario/INVESTIACION ACT 1.docx
@@ -1,6 +1,6 @@
 
 <file path=word/document.xml><?xml version="1.0" encoding="utf-8"?>
-<w:document xmlns:wpc="http://schemas.microsoft.com/office/word/2010/wordprocessingCanvas" xmlns:cx="http://schemas.microsoft.com/office/drawing/2014/chartex" xmlns:cx1="http://schemas.microsoft.com/office/drawing/2015/9/8/chartex" xmlns:cx2="http://schemas.microsoft.com/office/drawing/2015/10/21/chartex" xmlns:cx3="http://schemas.microsoft.com/office/drawing/2016/5/9/chartex" xmlns:cx4="http://schemas.microsoft.com/office/drawing/2016/5/10/chartex" xmlns:cx5="http://schemas.microsoft.com/office/drawing/2016/5/11/chartex" xmlns:cx6="http://schemas.microsoft.com/office/drawing/2016/5/12/chartex" xmlns:cx7="http://schemas.microsoft.com/office/drawing/2016/5/13/chartex" xmlns:cx8="http://schemas.microsoft.com/office/drawing/2016/5/14/chartex" xmlns:mc="http://schemas.openxmlformats.org/markup-compatibility/2006" xmlns:aink="http://schemas.microsoft.com/office/drawing/2016/ink" xmlns:am3d="http://schemas.microsoft.com/office/drawing/2017/model3d" xmlns:o="urn:schemas-microsoft-com:office:office" xmlns:oel="http://schemas.microsoft.com/office/2019/extlst" xmlns:r="http://schemas.openxmlformats.org/officeDocument/2006/relationships" xmlns:m="http://schemas.openxmlformats.org/officeDocument/2006/math" xmlns:v="urn:schemas-microsoft-com:vml" xmlns:wp14="http://schemas.microsoft.com/office/word/2010/wordprocessingDrawing" xmlns:wp="http://schemas.openxmlformats.org/drawingml/2006/wordprocessingDrawing" xmlns:w10="urn:schemas-microsoft-com:office:word" xmlns:w="http://schemas.openxmlformats.org/wordprocessingml/2006/main" xmlns:w14="http://schemas.microsoft.com/office/word/2010/wordml" xmlns:w15="http://schemas.microsoft.com/office/word/2012/wordml" xmlns:w16cex="http://schemas.microsoft.com/office/word/2018/wordml/cex" xmlns:w16cid="http://schemas.microsoft.com/office/word/2016/wordml/cid" xmlns:w16="http://schemas.microsoft.com/office/word/2018/wordml" xmlns:w16du="http://schemas.microsoft.com/office/word/2023/wordml/word16du" xmlns:w16sdtdh="http://schemas.microsoft.com/office/word/2020/wordml/sdtdatahash" xmlns:w16sdtfl="http://schemas.microsoft.com/office/word/2024/wordml/sdtformatlock" xmlns:w16se="http://schemas.microsoft.com/office/word/2015/wordml/symex" xmlns:wpg="http://schemas.microsoft.com/office/word/2010/wordprocessingGroup" xmlns:wpi="http://schemas.microsoft.com/office/word/2010/wordprocessingInk" xmlns:wne="http://schemas.microsoft.com/office/word/2006/wordml" xmlns:wps="http://schemas.microsoft.com/office/word/2010/wordprocessingShape" mc:Ignorable="w14 w15 w16se w16cid w16 w16cex w16sdtdh w16sdtfl w16du wp14">
+<w:document xmlns:wpc="http://schemas.microsoft.com/office/word/2010/wordprocessingCanvas" xmlns:cx="http://schemas.microsoft.com/office/drawing/2014/chartex" xmlns:cx1="http://schemas.microsoft.com/office/drawing/2015/9/8/chartex" xmlns:cx2="http://schemas.microsoft.com/office/drawing/2015/10/21/chartex" xmlns:cx3="http://schemas.microsoft.com/office/drawing/2016/5/9/chartex" xmlns:cx4="http://schemas.microsoft.com/office/drawing/2016/5/10/chartex" xmlns:cx5="http://schemas.microsoft.com/office/drawing/2016/5/11/chartex" xmlns:cx6="http://schemas.microsoft.com/office/drawing/2016/5/12/chartex" xmlns:cx7="http://schemas.microsoft.com/office/drawing/2016/5/13/chartex" xmlns:cx8="http://schemas.microsoft.com/office/drawing/2016/5/14/chartex" xmlns:mc="http://schemas.openxmlformats.org/markup-compatibility/2006" xmlns:aink="http://schemas.microsoft.com/office/drawing/2016/ink" xmlns:am3d="http://schemas.microsoft.com/office/drawing/2017/model3d" xmlns:o="urn:schemas-microsoft-com:office:office" xmlns:r="http://schemas.openxmlformats.org/officeDocument/2006/relationships" xmlns:m="http://schemas.openxmlformats.org/officeDocument/2006/math" xmlns:v="urn:schemas-microsoft-com:vml" xmlns:wp14="http://schemas.microsoft.com/office/word/2010/wordprocessingDrawing" xmlns:wp="http://schemas.openxmlformats.org/drawingml/2006/wordprocessingDrawing" xmlns:w10="urn:schemas-microsoft-com:office:word" xmlns:w="http://schemas.openxmlformats.org/wordprocessingml/2006/main" xmlns:w14="http://schemas.microsoft.com/office/word/2010/wordml" xmlns:w15="http://schemas.microsoft.com/office/word/2012/wordml" xmlns:w16cex="http://schemas.microsoft.com/office/word/2018/wordml/cex" xmlns:w16cid="http://schemas.microsoft.com/office/word/2016/wordml/cid" xmlns:w16="http://schemas.microsoft.com/office/word/2018/wordml" xmlns:w16se="http://schemas.microsoft.com/office/word/2015/wordml/symex" xmlns:wpg="http://schemas.microsoft.com/office/word/2010/wordprocessingGroup" xmlns:wpi="http://schemas.microsoft.com/office/word/2010/wordprocessingInk" xmlns:wne="http://schemas.microsoft.com/office/word/2006/wordml" xmlns:wps="http://schemas.microsoft.com/office/word/2010/wordprocessingShape" mc:Ignorable="w14 w15 w16se w16cid w16 w16cex wp14">
   <w:body>
     <w:p>
       <w:pPr>
@@ -32,6 +32,446 @@
         </w:rPr>
         <w:t>Investigación: Fundamentos de UX y Calidad del Software</w:t>
       </w:r>
+    </w:p>
+    <w:p>
+      <w:pPr>
+        <w:spacing w:after="0" w:line="240" w:lineRule="auto"/>
+        <w:outlineLvl w:val="0"/>
+        <w:rPr>
+          <w:rFonts w:ascii="Arial" w:eastAsia="Times New Roman" w:hAnsi="Arial" w:cs="Arial"/>
+          <w:b/>
+          <w:bCs/>
+          <w:color w:val="1F1F1F"/>
+          <w:kern w:val="36"/>
+          <w:sz w:val="24"/>
+          <w:szCs w:val="24"/>
+          <w:lang w:eastAsia="es-MX"/>
+          <w14:ligatures w14:val="none"/>
+        </w:rPr>
+      </w:pPr>
+      <w:r>
+        <w:rPr>
+          <w:rFonts w:ascii="Arial" w:eastAsia="Times New Roman" w:hAnsi="Arial" w:cs="Arial"/>
+          <w:b/>
+          <w:bCs/>
+          <w:color w:val="1F1F1F"/>
+          <w:kern w:val="36"/>
+          <w:sz w:val="24"/>
+          <w:szCs w:val="24"/>
+          <w:lang w:eastAsia="es-MX"/>
+          <w14:ligatures w14:val="none"/>
+        </w:rPr>
+        <w:t xml:space="preserve">Por: Rivera </w:t>
+      </w:r>
+      <w:proofErr w:type="spellStart"/>
+      <w:r>
+        <w:rPr>
+          <w:rFonts w:ascii="Arial" w:eastAsia="Times New Roman" w:hAnsi="Arial" w:cs="Arial"/>
+          <w:b/>
+          <w:bCs/>
+          <w:color w:val="1F1F1F"/>
+          <w:kern w:val="36"/>
+          <w:sz w:val="24"/>
+          <w:szCs w:val="24"/>
+          <w:lang w:eastAsia="es-MX"/>
+          <w14:ligatures w14:val="none"/>
+        </w:rPr>
+        <w:t>Hernandez</w:t>
+      </w:r>
+      <w:proofErr w:type="spellEnd"/>
+      <w:r>
+        <w:rPr>
+          <w:rFonts w:ascii="Arial" w:eastAsia="Times New Roman" w:hAnsi="Arial" w:cs="Arial"/>
+          <w:b/>
+          <w:bCs/>
+          <w:color w:val="1F1F1F"/>
+          <w:kern w:val="36"/>
+          <w:sz w:val="24"/>
+          <w:szCs w:val="24"/>
+          <w:lang w:eastAsia="es-MX"/>
+          <w14:ligatures w14:val="none"/>
+        </w:rPr>
+        <w:t xml:space="preserve"> </w:t>
+      </w:r>
+      <w:proofErr w:type="spellStart"/>
+      <w:r>
+        <w:rPr>
+          <w:rFonts w:ascii="Arial" w:eastAsia="Times New Roman" w:hAnsi="Arial" w:cs="Arial"/>
+          <w:b/>
+          <w:bCs/>
+          <w:color w:val="1F1F1F"/>
+          <w:kern w:val="36"/>
+          <w:sz w:val="24"/>
+          <w:szCs w:val="24"/>
+          <w:lang w:eastAsia="es-MX"/>
+          <w14:ligatures w14:val="none"/>
+        </w:rPr>
+        <w:t>Jose</w:t>
+      </w:r>
+      <w:proofErr w:type="spellEnd"/>
+      <w:r>
+        <w:rPr>
+          <w:rFonts w:ascii="Arial" w:eastAsia="Times New Roman" w:hAnsi="Arial" w:cs="Arial"/>
+          <w:b/>
+          <w:bCs/>
+          <w:color w:val="1F1F1F"/>
+          <w:kern w:val="36"/>
+          <w:sz w:val="24"/>
+          <w:szCs w:val="24"/>
+          <w:lang w:eastAsia="es-MX"/>
+          <w14:ligatures w14:val="none"/>
+        </w:rPr>
+        <w:t xml:space="preserve"> Carlos Adolfo, </w:t>
+      </w:r>
+      <w:proofErr w:type="spellStart"/>
+      <w:r>
+        <w:rPr>
+          <w:rFonts w:ascii="Arial" w:eastAsia="Times New Roman" w:hAnsi="Arial" w:cs="Arial"/>
+          <w:b/>
+          <w:bCs/>
+          <w:color w:val="1F1F1F"/>
+          <w:kern w:val="36"/>
+          <w:sz w:val="24"/>
+          <w:szCs w:val="24"/>
+          <w:lang w:eastAsia="es-MX"/>
+          <w14:ligatures w14:val="none"/>
+        </w:rPr>
+        <w:t>Garcia</w:t>
+      </w:r>
+      <w:proofErr w:type="spellEnd"/>
+      <w:r>
+        <w:rPr>
+          <w:rFonts w:ascii="Arial" w:eastAsia="Times New Roman" w:hAnsi="Arial" w:cs="Arial"/>
+          <w:b/>
+          <w:bCs/>
+          <w:color w:val="1F1F1F"/>
+          <w:kern w:val="36"/>
+          <w:sz w:val="24"/>
+          <w:szCs w:val="24"/>
+          <w:lang w:eastAsia="es-MX"/>
+          <w14:ligatures w14:val="none"/>
+        </w:rPr>
+        <w:t xml:space="preserve"> </w:t>
+      </w:r>
+      <w:proofErr w:type="spellStart"/>
+      <w:r>
+        <w:rPr>
+          <w:rFonts w:ascii="Arial" w:eastAsia="Times New Roman" w:hAnsi="Arial" w:cs="Arial"/>
+          <w:b/>
+          <w:bCs/>
+          <w:color w:val="1F1F1F"/>
+          <w:kern w:val="36"/>
+          <w:sz w:val="24"/>
+          <w:szCs w:val="24"/>
+          <w:lang w:eastAsia="es-MX"/>
+          <w14:ligatures w14:val="none"/>
+        </w:rPr>
+        <w:t>Garcia</w:t>
+      </w:r>
+      <w:proofErr w:type="spellEnd"/>
+      <w:r>
+        <w:rPr>
+          <w:rFonts w:ascii="Arial" w:eastAsia="Times New Roman" w:hAnsi="Arial" w:cs="Arial"/>
+          <w:b/>
+          <w:bCs/>
+          <w:color w:val="1F1F1F"/>
+          <w:kern w:val="36"/>
+          <w:sz w:val="24"/>
+          <w:szCs w:val="24"/>
+          <w:lang w:eastAsia="es-MX"/>
+          <w14:ligatures w14:val="none"/>
+        </w:rPr>
+        <w:t xml:space="preserve"> </w:t>
+      </w:r>
+      <w:r>
+        <w:rPr>
+          <w:rFonts w:ascii="Arial" w:eastAsia="Times New Roman" w:hAnsi="Arial" w:cs="Arial"/>
+          <w:b/>
+          <w:bCs/>
+          <w:color w:val="1F1F1F"/>
+          <w:kern w:val="36"/>
+          <w:sz w:val="24"/>
+          <w:szCs w:val="24"/>
+          <w:lang w:eastAsia="es-MX"/>
+          <w14:ligatures w14:val="none"/>
+        </w:rPr>
+        <w:t>Eduardo</w:t>
+      </w:r>
+      <w:r>
+        <w:rPr>
+          <w:rFonts w:ascii="Arial" w:eastAsia="Times New Roman" w:hAnsi="Arial" w:cs="Arial"/>
+          <w:b/>
+          <w:bCs/>
+          <w:color w:val="1F1F1F"/>
+          <w:kern w:val="36"/>
+          <w:sz w:val="24"/>
+          <w:szCs w:val="24"/>
+          <w:lang w:eastAsia="es-MX"/>
+          <w14:ligatures w14:val="none"/>
+        </w:rPr>
+        <w:t xml:space="preserve"> </w:t>
+      </w:r>
+      <w:r>
+        <w:rPr>
+          <w:rFonts w:ascii="Arial" w:eastAsia="Times New Roman" w:hAnsi="Arial" w:cs="Arial"/>
+          <w:b/>
+          <w:bCs/>
+          <w:color w:val="1F1F1F"/>
+          <w:kern w:val="36"/>
+          <w:sz w:val="24"/>
+          <w:szCs w:val="24"/>
+          <w:lang w:eastAsia="es-MX"/>
+          <w14:ligatures w14:val="none"/>
+        </w:rPr>
+        <w:t>Alejandro</w:t>
+      </w:r>
+      <w:r>
+        <w:rPr>
+          <w:rFonts w:ascii="Arial" w:eastAsia="Times New Roman" w:hAnsi="Arial" w:cs="Arial"/>
+          <w:b/>
+          <w:bCs/>
+          <w:color w:val="1F1F1F"/>
+          <w:kern w:val="36"/>
+          <w:sz w:val="24"/>
+          <w:szCs w:val="24"/>
+          <w:lang w:eastAsia="es-MX"/>
+          <w14:ligatures w14:val="none"/>
+        </w:rPr>
+        <w:t xml:space="preserve">, </w:t>
+      </w:r>
+      <w:r>
+        <w:rPr>
+          <w:rFonts w:ascii="Arial" w:eastAsia="Times New Roman" w:hAnsi="Arial" w:cs="Arial"/>
+          <w:b/>
+          <w:bCs/>
+          <w:color w:val="1F1F1F"/>
+          <w:kern w:val="36"/>
+          <w:sz w:val="24"/>
+          <w:szCs w:val="24"/>
+          <w:lang w:eastAsia="es-MX"/>
+          <w14:ligatures w14:val="none"/>
+        </w:rPr>
+        <w:t>Carranza</w:t>
+      </w:r>
+      <w:r>
+        <w:rPr>
+          <w:rFonts w:ascii="Arial" w:eastAsia="Times New Roman" w:hAnsi="Arial" w:cs="Arial"/>
+          <w:b/>
+          <w:bCs/>
+          <w:color w:val="1F1F1F"/>
+          <w:kern w:val="36"/>
+          <w:sz w:val="24"/>
+          <w:szCs w:val="24"/>
+          <w:lang w:eastAsia="es-MX"/>
+          <w14:ligatures w14:val="none"/>
+        </w:rPr>
+        <w:t xml:space="preserve"> </w:t>
+      </w:r>
+      <w:r>
+        <w:rPr>
+          <w:rFonts w:ascii="Arial" w:eastAsia="Times New Roman" w:hAnsi="Arial" w:cs="Arial"/>
+          <w:b/>
+          <w:bCs/>
+          <w:color w:val="1F1F1F"/>
+          <w:kern w:val="36"/>
+          <w:sz w:val="24"/>
+          <w:szCs w:val="24"/>
+          <w:lang w:eastAsia="es-MX"/>
+          <w14:ligatures w14:val="none"/>
+        </w:rPr>
+        <w:t>Maya</w:t>
+      </w:r>
+      <w:r>
+        <w:rPr>
+          <w:rFonts w:ascii="Arial" w:eastAsia="Times New Roman" w:hAnsi="Arial" w:cs="Arial"/>
+          <w:b/>
+          <w:bCs/>
+          <w:color w:val="1F1F1F"/>
+          <w:kern w:val="36"/>
+          <w:sz w:val="24"/>
+          <w:szCs w:val="24"/>
+          <w:lang w:eastAsia="es-MX"/>
+          <w14:ligatures w14:val="none"/>
+        </w:rPr>
+        <w:t xml:space="preserve"> </w:t>
+      </w:r>
+      <w:r>
+        <w:rPr>
+          <w:rFonts w:ascii="Arial" w:eastAsia="Times New Roman" w:hAnsi="Arial" w:cs="Arial"/>
+          <w:b/>
+          <w:bCs/>
+          <w:color w:val="1F1F1F"/>
+          <w:kern w:val="36"/>
+          <w:sz w:val="24"/>
+          <w:szCs w:val="24"/>
+          <w:lang w:eastAsia="es-MX"/>
+          <w14:ligatures w14:val="none"/>
+        </w:rPr>
+        <w:t>Edwin</w:t>
+      </w:r>
+      <w:r>
+        <w:rPr>
+          <w:rFonts w:ascii="Arial" w:eastAsia="Times New Roman" w:hAnsi="Arial" w:cs="Arial"/>
+          <w:b/>
+          <w:bCs/>
+          <w:color w:val="1F1F1F"/>
+          <w:kern w:val="36"/>
+          <w:sz w:val="24"/>
+          <w:szCs w:val="24"/>
+          <w:lang w:eastAsia="es-MX"/>
+          <w14:ligatures w14:val="none"/>
+        </w:rPr>
+        <w:t xml:space="preserve"> </w:t>
+      </w:r>
+      <w:r>
+        <w:rPr>
+          <w:rFonts w:ascii="Arial" w:eastAsia="Times New Roman" w:hAnsi="Arial" w:cs="Arial"/>
+          <w:b/>
+          <w:bCs/>
+          <w:color w:val="1F1F1F"/>
+          <w:kern w:val="36"/>
+          <w:sz w:val="24"/>
+          <w:szCs w:val="24"/>
+          <w:lang w:eastAsia="es-MX"/>
+          <w14:ligatures w14:val="none"/>
+        </w:rPr>
+        <w:t>Enrique</w:t>
+      </w:r>
+      <w:r>
+        <w:rPr>
+          <w:rFonts w:ascii="Arial" w:eastAsia="Times New Roman" w:hAnsi="Arial" w:cs="Arial"/>
+          <w:b/>
+          <w:bCs/>
+          <w:color w:val="1F1F1F"/>
+          <w:kern w:val="36"/>
+          <w:sz w:val="24"/>
+          <w:szCs w:val="24"/>
+          <w:lang w:eastAsia="es-MX"/>
+          <w14:ligatures w14:val="none"/>
+        </w:rPr>
+        <w:t xml:space="preserve">, </w:t>
+      </w:r>
+      <w:proofErr w:type="spellStart"/>
+      <w:r>
+        <w:rPr>
+          <w:rFonts w:ascii="Arial" w:eastAsia="Times New Roman" w:hAnsi="Arial" w:cs="Arial"/>
+          <w:b/>
+          <w:bCs/>
+          <w:color w:val="1F1F1F"/>
+          <w:kern w:val="36"/>
+          <w:sz w:val="24"/>
+          <w:szCs w:val="24"/>
+          <w:lang w:eastAsia="es-MX"/>
+          <w14:ligatures w14:val="none"/>
+        </w:rPr>
+        <w:t>Cedric</w:t>
+      </w:r>
+      <w:proofErr w:type="spellEnd"/>
+      <w:r>
+        <w:rPr>
+          <w:rFonts w:ascii="Arial" w:eastAsia="Times New Roman" w:hAnsi="Arial" w:cs="Arial"/>
+          <w:b/>
+          <w:bCs/>
+          <w:color w:val="1F1F1F"/>
+          <w:kern w:val="36"/>
+          <w:sz w:val="24"/>
+          <w:szCs w:val="24"/>
+          <w:lang w:eastAsia="es-MX"/>
+          <w14:ligatures w14:val="none"/>
+        </w:rPr>
+        <w:t xml:space="preserve"> </w:t>
+      </w:r>
+      <w:proofErr w:type="spellStart"/>
+      <w:r>
+        <w:rPr>
+          <w:rFonts w:ascii="Arial" w:eastAsia="Times New Roman" w:hAnsi="Arial" w:cs="Arial"/>
+          <w:b/>
+          <w:bCs/>
+          <w:color w:val="1F1F1F"/>
+          <w:kern w:val="36"/>
+          <w:sz w:val="24"/>
+          <w:szCs w:val="24"/>
+          <w:lang w:eastAsia="es-MX"/>
+          <w14:ligatures w14:val="none"/>
+        </w:rPr>
+        <w:t>Anjulian</w:t>
+      </w:r>
+      <w:proofErr w:type="spellEnd"/>
+      <w:r>
+        <w:rPr>
+          <w:rFonts w:ascii="Arial" w:eastAsia="Times New Roman" w:hAnsi="Arial" w:cs="Arial"/>
+          <w:b/>
+          <w:bCs/>
+          <w:color w:val="1F1F1F"/>
+          <w:kern w:val="36"/>
+          <w:sz w:val="24"/>
+          <w:szCs w:val="24"/>
+          <w:lang w:eastAsia="es-MX"/>
+          <w14:ligatures w14:val="none"/>
+        </w:rPr>
+        <w:t xml:space="preserve"> </w:t>
+      </w:r>
+      <w:proofErr w:type="spellStart"/>
+      <w:r>
+        <w:rPr>
+          <w:rFonts w:ascii="Arial" w:eastAsia="Times New Roman" w:hAnsi="Arial" w:cs="Arial"/>
+          <w:b/>
+          <w:bCs/>
+          <w:color w:val="1F1F1F"/>
+          <w:kern w:val="36"/>
+          <w:sz w:val="24"/>
+          <w:szCs w:val="24"/>
+          <w:lang w:eastAsia="es-MX"/>
+          <w14:ligatures w14:val="none"/>
+        </w:rPr>
+        <w:t>Godinez</w:t>
+      </w:r>
+      <w:proofErr w:type="spellEnd"/>
+      <w:r>
+        <w:rPr>
+          <w:rFonts w:ascii="Arial" w:eastAsia="Times New Roman" w:hAnsi="Arial" w:cs="Arial"/>
+          <w:b/>
+          <w:bCs/>
+          <w:color w:val="1F1F1F"/>
+          <w:kern w:val="36"/>
+          <w:sz w:val="24"/>
+          <w:szCs w:val="24"/>
+          <w:lang w:eastAsia="es-MX"/>
+          <w14:ligatures w14:val="none"/>
+        </w:rPr>
+        <w:t xml:space="preserve"> Olvera</w:t>
+      </w:r>
+      <w:r>
+        <w:rPr>
+          <w:rFonts w:ascii="Arial" w:eastAsia="Times New Roman" w:hAnsi="Arial" w:cs="Arial"/>
+          <w:b/>
+          <w:bCs/>
+          <w:color w:val="1F1F1F"/>
+          <w:kern w:val="36"/>
+          <w:sz w:val="24"/>
+          <w:szCs w:val="24"/>
+          <w:lang w:eastAsia="es-MX"/>
+          <w14:ligatures w14:val="none"/>
+        </w:rPr>
+        <w:t>.</w:t>
+      </w:r>
+    </w:p>
+    <w:p>
+      <w:pPr>
+        <w:spacing w:after="0" w:line="240" w:lineRule="auto"/>
+        <w:outlineLvl w:val="0"/>
+        <w:rPr>
+          <w:rFonts w:ascii="Arial" w:eastAsia="Times New Roman" w:hAnsi="Arial" w:cs="Arial"/>
+          <w:b/>
+          <w:bCs/>
+          <w:color w:val="1F1F1F"/>
+          <w:kern w:val="36"/>
+          <w:sz w:val="28"/>
+          <w:szCs w:val="28"/>
+          <w:lang w:eastAsia="es-MX"/>
+          <w14:ligatures w14:val="none"/>
+        </w:rPr>
+      </w:pPr>
     </w:p>
     <w:p>
       <w:pPr>
@@ -707,6 +1147,7 @@
           <w:lang w:eastAsia="es-MX"/>
           <w14:ligatures w14:val="none"/>
         </w:rPr>
+        <w:lastRenderedPageBreak/>
         <w:t>ISO/IEC 25010</w:t>
       </w:r>
       <w:r>
@@ -795,7 +1236,6 @@
           <w:lang w:eastAsia="es-MX"/>
           <w14:ligatures w14:val="none"/>
         </w:rPr>
-        <w:lastRenderedPageBreak/>
         <w:t>4. Atributos de Calidad</w:t>
       </w:r>
     </w:p>
@@ -1345,7 +1785,6 @@
           <w:sz w:val="40"/>
           <w:szCs w:val="40"/>
         </w:rPr>
-        <w:lastRenderedPageBreak/>
         <w:t>Diseño Centrado en el Usuario (DCU) y Estándares</w:t>
       </w:r>
     </w:p>
@@ -1681,7 +2120,23 @@
           <w:i/>
           <w:iCs/>
         </w:rPr>
-        <w:t xml:space="preserve"> interactive </w:t>
+        <w:t xml:space="preserve"> </w:t>
+      </w:r>
+      <w:proofErr w:type="spellStart"/>
+      <w:r>
+        <w:rPr>
+          <w:i/>
+          <w:iCs/>
+        </w:rPr>
+        <w:t>interactive</w:t>
+      </w:r>
+      <w:proofErr w:type="spellEnd"/>
+      <w:r>
+        <w:rPr>
+          <w:i/>
+          <w:iCs/>
+        </w:rPr>
+        <w:t xml:space="preserve"> </w:t>
       </w:r>
       <w:proofErr w:type="spellStart"/>
       <w:r>
@@ -1722,15 +2177,7 @@
         </w:numPr>
       </w:pPr>
       <w:r>
-        <w:t xml:space="preserve">La </w:t>
-      </w:r>
-      <w:proofErr w:type="gramStart"/>
-      <w:r>
-        <w:t>participación activa</w:t>
-      </w:r>
-      <w:proofErr w:type="gramEnd"/>
-      <w:r>
-        <w:t xml:space="preserve"> de los usuarios y una clara comprensión de los requisitos de usuario y de tarea.</w:t>
+        <w:t>La participación activa de los usuarios y una clara comprensión de los requisitos de usuario y de tarea.</w:t>
       </w:r>
     </w:p>
     <w:p>
@@ -1752,6 +2199,7 @@
         </w:numPr>
       </w:pPr>
       <w:r>
+        <w:lastRenderedPageBreak/>
         <w:t>El diseño iterativo (probar, evaluar y corregir de manera constante).</w:t>
       </w:r>
     </w:p>
@@ -1763,7 +2211,6 @@
         </w:numPr>
       </w:pPr>
       <w:r>
-        <w:lastRenderedPageBreak/>
         <w:t>El diseño multidisciplinario (integrar expertos en diseño, desarrollo, psicología, etc.).</w:t>
       </w:r>
     </w:p>
@@ -1784,6 +2231,456 @@
       <w:r>
         <w:br/>
       </w:r>
+    </w:p>
+    <w:p>
+      <w:pPr>
+        <w:pStyle w:val="Ttulo1"/>
+      </w:pPr>
+      <w:r>
+        <w:t>ETAPAS Y METODOS DEL DCU</w:t>
+      </w:r>
+    </w:p>
+    <w:p/>
+    <w:p>
+      <w:r>
+        <w:t>El Diseño Centrado en el Usuario (DCU) —según la norma ISO 9241-210— es un proceso iterativo de desarrollo que coloca al usuario y sus necesidades en el centro de todas las fases. Las etapas del DCU se basan 5 puntos cuyos cuales son:</w:t>
+      </w:r>
+    </w:p>
+    <w:p/>
+    <w:p/>
+    <w:p>
+      <w:pPr>
+        <w:rPr>
+          <w:rFonts w:asciiTheme="majorHAnsi" w:hAnsiTheme="majorHAnsi"/>
+          <w:b/>
+          <w:bCs/>
+          <w:color w:val="98A7BD" w:themeColor="text2" w:themeTint="80"/>
+          <w:sz w:val="28"/>
+          <w:szCs w:val="28"/>
+        </w:rPr>
+      </w:pPr>
+      <w:r>
+        <w:rPr>
+          <w:rFonts w:asciiTheme="majorHAnsi" w:hAnsiTheme="majorHAnsi"/>
+          <w:b/>
+          <w:bCs/>
+          <w:color w:val="98A7BD" w:themeColor="text2" w:themeTint="80"/>
+          <w:sz w:val="28"/>
+          <w:szCs w:val="28"/>
+        </w:rPr>
+        <w:t>Etapas del DCU</w:t>
+      </w:r>
+    </w:p>
+    <w:p/>
+    <w:p>
+      <w:r>
+        <w:t>•</w:t>
+      </w:r>
+      <w:r>
+        <w:rPr>
+          <w:b/>
+          <w:bCs/>
+        </w:rPr>
+        <w:t xml:space="preserve"> 1. </w:t>
+      </w:r>
+      <w:r>
+        <w:rPr>
+          <w:b/>
+          <w:bCs/>
+        </w:rPr>
+        <w:t xml:space="preserve">Investigación: </w:t>
+      </w:r>
+      <w:r>
+        <w:t>Comprende al usuario mediante entrevistas, observación y análisis de necesidades o tareas reales.</w:t>
+      </w:r>
+    </w:p>
+    <w:p>
+      <w:r>
+        <w:rPr>
+          <w:b/>
+          <w:bCs/>
+        </w:rPr>
+        <w:t xml:space="preserve">• </w:t>
+      </w:r>
+      <w:proofErr w:type="gramStart"/>
+      <w:r>
+        <w:rPr>
+          <w:b/>
+          <w:bCs/>
+        </w:rPr>
+        <w:t>2.Ideación</w:t>
+      </w:r>
+      <w:proofErr w:type="gramEnd"/>
+      <w:r>
+        <w:t>: Genera conceptos creativos, bocetos y propuestas iniciales para resolver los problemas detectados.</w:t>
+      </w:r>
+    </w:p>
+    <w:p>
+      <w:r>
+        <w:rPr>
+          <w:b/>
+          <w:bCs/>
+        </w:rPr>
+        <w:t>•3. Diseño:</w:t>
+      </w:r>
+      <w:r>
+        <w:t xml:space="preserve"> Construye prototipos (de baja y alta fidelidad) y </w:t>
+      </w:r>
+      <w:proofErr w:type="spellStart"/>
+      <w:r>
+        <w:t>wireframes</w:t>
+      </w:r>
+      <w:proofErr w:type="spellEnd"/>
+      <w:r>
+        <w:t xml:space="preserve"> de la interfaz o producto.</w:t>
+      </w:r>
+    </w:p>
+    <w:p>
+      <w:r>
+        <w:rPr>
+          <w:b/>
+          <w:bCs/>
+        </w:rPr>
+        <w:t xml:space="preserve">•4. Desarrollo: </w:t>
+      </w:r>
+      <w:r>
+        <w:t>Implementa la solución funcional a partir de los prototipos validados.</w:t>
+      </w:r>
+    </w:p>
+    <w:p>
+      <w:r>
+        <w:rPr>
+          <w:b/>
+          <w:bCs/>
+        </w:rPr>
+        <w:t xml:space="preserve">• </w:t>
+      </w:r>
+      <w:proofErr w:type="gramStart"/>
+      <w:r>
+        <w:rPr>
+          <w:b/>
+          <w:bCs/>
+        </w:rPr>
+        <w:t>5.Evaluación</w:t>
+      </w:r>
+      <w:proofErr w:type="gramEnd"/>
+      <w:r>
+        <w:rPr>
+          <w:b/>
+          <w:bCs/>
+        </w:rPr>
+        <w:t>:</w:t>
+      </w:r>
+      <w:r>
+        <w:t xml:space="preserve"> Prueba el producto con usuarios reales para detectar errores, medir la satisfacción y ajustar el diseño.</w:t>
+      </w:r>
+    </w:p>
+    <w:p/>
+    <w:p/>
+    <w:p>
+      <w:r>
+        <w:t>Dichas etapas requieren de métodos para llevar un orden y poder entender los resultados de dichas etapas</w:t>
+      </w:r>
+    </w:p>
+    <w:p/>
+    <w:p>
+      <w:pPr>
+        <w:rPr>
+          <w:rFonts w:asciiTheme="majorHAnsi" w:hAnsiTheme="majorHAnsi"/>
+          <w:color w:val="4472C4" w:themeColor="accent1"/>
+          <w:sz w:val="28"/>
+          <w:szCs w:val="28"/>
+        </w:rPr>
+      </w:pPr>
+      <w:r>
+        <w:rPr>
+          <w:rFonts w:asciiTheme="majorHAnsi" w:hAnsiTheme="majorHAnsi"/>
+          <w:color w:val="4472C4" w:themeColor="accent1"/>
+          <w:sz w:val="28"/>
+          <w:szCs w:val="28"/>
+        </w:rPr>
+        <w:t>METODOS DE DCU</w:t>
+      </w:r>
+    </w:p>
+    <w:p>
+      <w:pPr>
+        <w:rPr>
+          <w:color w:val="000000" w:themeColor="text1"/>
+        </w:rPr>
+      </w:pPr>
+      <w:r>
+        <w:rPr>
+          <w:rFonts w:asciiTheme="majorHAnsi" w:hAnsiTheme="majorHAnsi"/>
+          <w:color w:val="000000" w:themeColor="text1"/>
+          <w:sz w:val="28"/>
+          <w:szCs w:val="28"/>
+        </w:rPr>
+        <w:lastRenderedPageBreak/>
+        <w:t>•</w:t>
+      </w:r>
+      <w:r>
+        <w:rPr>
+          <w:rFonts w:asciiTheme="majorHAnsi" w:hAnsiTheme="majorHAnsi"/>
+          <w:color w:val="4472C4" w:themeColor="accent1"/>
+          <w:sz w:val="28"/>
+          <w:szCs w:val="28"/>
+        </w:rPr>
+        <w:t xml:space="preserve"> </w:t>
+      </w:r>
+      <w:r>
+        <w:rPr>
+          <w:b/>
+          <w:bCs/>
+          <w:color w:val="000000" w:themeColor="text1"/>
+        </w:rPr>
+        <w:t xml:space="preserve">Grupos focales: </w:t>
+      </w:r>
+      <w:r>
+        <w:rPr>
+          <w:color w:val="000000" w:themeColor="text1"/>
+        </w:rPr>
+        <w:t>Entrevistas grupales guiadas para recopilar opiniones, expectativas y retroalimentación cualitativa.</w:t>
+      </w:r>
+      <w:r>
+        <w:rPr>
+          <w:color w:val="000000" w:themeColor="text1"/>
+        </w:rPr>
+        <w:t xml:space="preserve"> Permiten discutir opiniones, percepciones, actitudes y deseos sobre un producto o concepto para recolectar datos cualitativos rápidamente.</w:t>
+      </w:r>
+    </w:p>
+    <w:p>
+      <w:pPr>
+        <w:rPr>
+          <w:color w:val="000000" w:themeColor="text1"/>
+        </w:rPr>
+      </w:pPr>
+    </w:p>
+    <w:p>
+      <w:pPr>
+        <w:rPr>
+          <w:color w:val="000000" w:themeColor="text1"/>
+        </w:rPr>
+      </w:pPr>
+      <w:r>
+        <w:rPr>
+          <w:color w:val="000000" w:themeColor="text1"/>
+        </w:rPr>
+        <w:t xml:space="preserve">• </w:t>
+      </w:r>
+      <w:r>
+        <w:rPr>
+          <w:b/>
+          <w:bCs/>
+          <w:color w:val="000000" w:themeColor="text1"/>
+        </w:rPr>
+        <w:t>Pruebas de usabilidad:</w:t>
+      </w:r>
+      <w:r>
+        <w:rPr>
+          <w:color w:val="000000" w:themeColor="text1"/>
+        </w:rPr>
+        <w:t xml:space="preserve"> </w:t>
+      </w:r>
+      <w:r>
+        <w:rPr>
+          <w:color w:val="000000" w:themeColor="text1"/>
+        </w:rPr>
+        <w:t>Sesiones individuales donde se observa a un usuario real interactuar con un prototipo o producto final mientras intenta completar tareas específicas. Ayudan a identificar problemas de navegación, confusión en la interfaz, errores de diseño y a medir qué tan fácil e intuitivo es el producto.</w:t>
+      </w:r>
+    </w:p>
+    <w:p>
+      <w:pPr>
+        <w:rPr>
+          <w:color w:val="000000" w:themeColor="text1"/>
+        </w:rPr>
+      </w:pPr>
+    </w:p>
+    <w:p>
+      <w:pPr>
+        <w:rPr>
+          <w:color w:val="000000" w:themeColor="text1"/>
+        </w:rPr>
+      </w:pPr>
+    </w:p>
+    <w:p>
+      <w:pPr>
+        <w:rPr>
+          <w:color w:val="000000" w:themeColor="text1"/>
+        </w:rPr>
+      </w:pPr>
+      <w:r>
+        <w:rPr>
+          <w:color w:val="000000" w:themeColor="text1"/>
+        </w:rPr>
+        <w:t xml:space="preserve">• </w:t>
+      </w:r>
+      <w:r>
+        <w:rPr>
+          <w:b/>
+          <w:bCs/>
+          <w:color w:val="000000" w:themeColor="text1"/>
+        </w:rPr>
+        <w:t>Otros métodos:</w:t>
+      </w:r>
+      <w:r>
+        <w:rPr>
+          <w:color w:val="000000" w:themeColor="text1"/>
+        </w:rPr>
+        <w:t xml:space="preserve"> </w:t>
+      </w:r>
+    </w:p>
+    <w:p>
+      <w:pPr>
+        <w:rPr>
+          <w:color w:val="000000" w:themeColor="text1"/>
+        </w:rPr>
+      </w:pPr>
+      <w:r>
+        <w:rPr>
+          <w:color w:val="000000" w:themeColor="text1"/>
+        </w:rPr>
+        <w:t>• Entrevistas a usuarios: Charlas uno a uno para profundizar en las motivaciones y experiencias individuales.</w:t>
+      </w:r>
+    </w:p>
+    <w:p>
+      <w:pPr>
+        <w:rPr>
+          <w:color w:val="000000" w:themeColor="text1"/>
+        </w:rPr>
+      </w:pPr>
+      <w:r>
+        <w:rPr>
+          <w:color w:val="000000" w:themeColor="text1"/>
+        </w:rPr>
+        <w:t>• Encuestas y cuestionarios: Herramientas cuantitativas para recopilar datos de una audiencia más amplia.</w:t>
+      </w:r>
+    </w:p>
+    <w:p>
+      <w:pPr>
+        <w:rPr>
+          <w:color w:val="000000" w:themeColor="text1"/>
+        </w:rPr>
+      </w:pPr>
+      <w:r>
+        <w:rPr>
+          <w:color w:val="000000" w:themeColor="text1"/>
+        </w:rPr>
+        <w:t>• Observación de campo / Etnografía: Observar a los usuarios en su entorno natural para entender cómo actúan realmente (y no solo lo que dicen que hacen).</w:t>
+      </w:r>
+    </w:p>
+    <w:p>
+      <w:pPr>
+        <w:rPr>
+          <w:color w:val="000000" w:themeColor="text1"/>
+        </w:rPr>
+      </w:pPr>
+      <w:r>
+        <w:rPr>
+          <w:color w:val="000000" w:themeColor="text1"/>
+        </w:rPr>
+        <w:t>• Clasificación de tarjetas (</w:t>
+      </w:r>
+      <w:proofErr w:type="spellStart"/>
+      <w:r>
+        <w:rPr>
+          <w:color w:val="000000" w:themeColor="text1"/>
+        </w:rPr>
+        <w:t>Card</w:t>
+      </w:r>
+      <w:proofErr w:type="spellEnd"/>
+      <w:r>
+        <w:rPr>
+          <w:color w:val="000000" w:themeColor="text1"/>
+        </w:rPr>
+        <w:t xml:space="preserve"> </w:t>
+      </w:r>
+      <w:proofErr w:type="spellStart"/>
+      <w:r>
+        <w:rPr>
+          <w:color w:val="000000" w:themeColor="text1"/>
+        </w:rPr>
+        <w:t>Sorting</w:t>
+      </w:r>
+      <w:proofErr w:type="spellEnd"/>
+      <w:r>
+        <w:rPr>
+          <w:color w:val="000000" w:themeColor="text1"/>
+        </w:rPr>
+        <w:t>): Técnica para entender cómo organizan y categorizan la información los usuarios, ideal para diseñar la arquitectura de un sitio web o app.</w:t>
+      </w:r>
+    </w:p>
+    <w:p>
+      <w:pPr>
+        <w:rPr>
+          <w:color w:val="000000" w:themeColor="text1"/>
+        </w:rPr>
+      </w:pPr>
+    </w:p>
+    <w:p>
+      <w:pPr>
+        <w:rPr>
+          <w:color w:val="000000" w:themeColor="text1"/>
+        </w:rPr>
+      </w:pPr>
+      <w:r>
+        <w:rPr>
+          <w:color w:val="000000" w:themeColor="text1"/>
+        </w:rPr>
+        <w:t xml:space="preserve">Existen Muchos </w:t>
+      </w:r>
+      <w:proofErr w:type="spellStart"/>
+      <w:r>
+        <w:rPr>
+          <w:color w:val="000000" w:themeColor="text1"/>
+        </w:rPr>
+        <w:t>mas</w:t>
+      </w:r>
+      <w:proofErr w:type="spellEnd"/>
+      <w:r>
+        <w:rPr>
+          <w:color w:val="000000" w:themeColor="text1"/>
+        </w:rPr>
+        <w:t xml:space="preserve"> </w:t>
+      </w:r>
+      <w:proofErr w:type="spellStart"/>
+      <w:proofErr w:type="gramStart"/>
+      <w:r>
+        <w:rPr>
+          <w:color w:val="000000" w:themeColor="text1"/>
+        </w:rPr>
+        <w:t>metodos</w:t>
+      </w:r>
+      <w:proofErr w:type="spellEnd"/>
+      <w:proofErr w:type="gramEnd"/>
+      <w:r>
+        <w:rPr>
+          <w:color w:val="000000" w:themeColor="text1"/>
+        </w:rPr>
+        <w:t xml:space="preserve"> pero estos son algunos de los </w:t>
+      </w:r>
+      <w:proofErr w:type="spellStart"/>
+      <w:r>
+        <w:rPr>
+          <w:color w:val="000000" w:themeColor="text1"/>
+        </w:rPr>
+        <w:t>mas</w:t>
+      </w:r>
+      <w:proofErr w:type="spellEnd"/>
+      <w:r>
+        <w:rPr>
+          <w:color w:val="000000" w:themeColor="text1"/>
+        </w:rPr>
+        <w:t xml:space="preserve"> importantes.</w:t>
+      </w:r>
+    </w:p>
+    <w:p>
+      <w:pPr>
+        <w:ind w:left="720"/>
+        <w:rPr>
+          <w:b/>
+          <w:bCs/>
+        </w:rPr>
+      </w:pPr>
     </w:p>
     <w:p>
       <w:pPr>
@@ -1806,7 +2703,7 @@
 </file>
 
 <file path=word/numbering.xml><?xml version="1.0" encoding="utf-8"?>
-<w:numbering xmlns:wpc="http://schemas.microsoft.com/office/word/2010/wordprocessingCanvas" xmlns:cx="http://schemas.microsoft.com/office/drawing/2014/chartex" xmlns:cx1="http://schemas.microsoft.com/office/drawing/2015/9/8/chartex" xmlns:cx2="http://schemas.microsoft.com/office/drawing/2015/10/21/chartex" xmlns:cx3="http://schemas.microsoft.com/office/drawing/2016/5/9/chartex" xmlns:cx4="http://schemas.microsoft.com/office/drawing/2016/5/10/chartex" xmlns:cx5="http://schemas.microsoft.com/office/drawing/2016/5/11/chartex" xmlns:cx6="http://schemas.microsoft.com/office/drawing/2016/5/12/chartex" xmlns:cx7="http://schemas.microsoft.com/office/drawing/2016/5/13/chartex" xmlns:cx8="http://schemas.microsoft.com/office/drawing/2016/5/14/chartex" xmlns:mc="http://schemas.openxmlformats.org/markup-compatibility/2006" xmlns:aink="http://schemas.microsoft.com/office/drawing/2016/ink" xmlns:am3d="http://schemas.microsoft.com/office/drawing/2017/model3d" xmlns:o="urn:schemas-microsoft-com:office:office" xmlns:oel="http://schemas.microsoft.com/office/2019/extlst" xmlns:r="http://schemas.openxmlformats.org/officeDocument/2006/relationships" xmlns:m="http://schemas.openxmlformats.org/officeDocument/2006/math" xmlns:v="urn:schemas-microsoft-com:vml" xmlns:wp14="http://schemas.microsoft.com/office/word/2010/wordprocessingDrawing" xmlns:wp="http://schemas.openxmlformats.org/drawingml/2006/wordprocessingDrawing" xmlns:w10="urn:schemas-microsoft-com:office:word" xmlns:w="http://schemas.openxmlformats.org/wordprocessingml/2006/main" xmlns:w14="http://schemas.microsoft.com/office/word/2010/wordml" xmlns:w15="http://schemas.microsoft.com/office/word/2012/wordml" xmlns:w16cex="http://schemas.microsoft.com/office/word/2018/wordml/cex" xmlns:w16cid="http://schemas.microsoft.com/office/word/2016/wordml/cid" xmlns:w16="http://schemas.microsoft.com/office/word/2018/wordml" xmlns:w16du="http://schemas.microsoft.com/office/word/2023/wordml/word16du" xmlns:w16sdtdh="http://schemas.microsoft.com/office/word/2020/wordml/sdtdatahash" xmlns:w16sdtfl="http://schemas.microsoft.com/office/word/2024/wordml/sdtformatlock" xmlns:w16se="http://schemas.microsoft.com/office/word/2015/wordml/symex" xmlns:wpg="http://schemas.microsoft.com/office/word/2010/wordprocessingGroup" xmlns:wpi="http://schemas.microsoft.com/office/word/2010/wordprocessingInk" xmlns:wne="http://schemas.microsoft.com/office/word/2006/wordml" xmlns:wps="http://schemas.microsoft.com/office/word/2010/wordprocessingShape" mc:Ignorable="w14 w15 w16se w16cid w16 w16cex w16sdtdh w16sdtfl w16du wp14">
+<w:numbering xmlns:wpc="http://schemas.microsoft.com/office/word/2010/wordprocessingCanvas" xmlns:cx="http://schemas.microsoft.com/office/drawing/2014/chartex" xmlns:cx1="http://schemas.microsoft.com/office/drawing/2015/9/8/chartex" xmlns:cx2="http://schemas.microsoft.com/office/drawing/2015/10/21/chartex" xmlns:cx3="http://schemas.microsoft.com/office/drawing/2016/5/9/chartex" xmlns:cx4="http://schemas.microsoft.com/office/drawing/2016/5/10/chartex" xmlns:cx5="http://schemas.microsoft.com/office/drawing/2016/5/11/chartex" xmlns:cx6="http://schemas.microsoft.com/office/drawing/2016/5/12/chartex" xmlns:cx7="http://schemas.microsoft.com/office/drawing/2016/5/13/chartex" xmlns:cx8="http://schemas.microsoft.com/office/drawing/2016/5/14/chartex" xmlns:mc="http://schemas.openxmlformats.org/markup-compatibility/2006" xmlns:aink="http://schemas.microsoft.com/office/drawing/2016/ink" xmlns:am3d="http://schemas.microsoft.com/office/drawing/2017/model3d" xmlns:o="urn:schemas-microsoft-com:office:office" xmlns:r="http://schemas.openxmlformats.org/officeDocument/2006/relationships" xmlns:m="http://schemas.openxmlformats.org/officeDocument/2006/math" xmlns:v="urn:schemas-microsoft-com:vml" xmlns:wp14="http://schemas.microsoft.com/office/word/2010/wordprocessingDrawing" xmlns:wp="http://schemas.openxmlformats.org/drawingml/2006/wordprocessingDrawing" xmlns:w10="urn:schemas-microsoft-com:office:word" xmlns:w="http://schemas.openxmlformats.org/wordprocessingml/2006/main" xmlns:w14="http://schemas.microsoft.com/office/word/2010/wordml" xmlns:w15="http://schemas.microsoft.com/office/word/2012/wordml" xmlns:w16cex="http://schemas.microsoft.com/office/word/2018/wordml/cex" xmlns:w16cid="http://schemas.microsoft.com/office/word/2016/wordml/cid" xmlns:w16="http://schemas.microsoft.com/office/word/2018/wordml" xmlns:w16se="http://schemas.microsoft.com/office/word/2015/wordml/symex" xmlns:wpg="http://schemas.microsoft.com/office/word/2010/wordprocessingGroup" xmlns:wpi="http://schemas.microsoft.com/office/word/2010/wordprocessingInk" xmlns:wne="http://schemas.microsoft.com/office/word/2006/wordml" xmlns:wps="http://schemas.microsoft.com/office/word/2010/wordprocessingShape" mc:Ignorable="w14 w15 w16se w16cid w16 w16cex wp14">
   <w:abstractNum w:abstractNumId="0" w15:restartNumberingAfterBreak="0">
     <w:nsid w:val="23883E91"/>
     <w:multiLevelType w:val="multilevel"/>
@@ -2403,23 +3300,23 @@
       </w:rPr>
     </w:lvl>
   </w:abstractNum>
-  <w:num w:numId="1" w16cid:durableId="1966736855">
+  <w:num w:numId="1">
     <w:abstractNumId w:val="2"/>
   </w:num>
-  <w:num w:numId="2" w16cid:durableId="963001396">
+  <w:num w:numId="2">
     <w:abstractNumId w:val="3"/>
   </w:num>
-  <w:num w:numId="3" w16cid:durableId="917443335">
+  <w:num w:numId="3">
     <w:abstractNumId w:val="1"/>
   </w:num>
-  <w:num w:numId="4" w16cid:durableId="767775470">
+  <w:num w:numId="4">
     <w:abstractNumId w:val="0"/>
   </w:num>
 </w:numbering>
 </file>
 
 <file path=word/styles.xml><?xml version="1.0" encoding="utf-8"?>
-<w:styles xmlns:mc="http://schemas.openxmlformats.org/markup-compatibility/2006" xmlns:r="http://schemas.openxmlformats.org/officeDocument/2006/relationships" xmlns:w="http://schemas.openxmlformats.org/wordprocessingml/2006/main" xmlns:w14="http://schemas.microsoft.com/office/word/2010/wordml" xmlns:w15="http://schemas.microsoft.com/office/word/2012/wordml" xmlns:w16cex="http://schemas.microsoft.com/office/word/2018/wordml/cex" xmlns:w16cid="http://schemas.microsoft.com/office/word/2016/wordml/cid" xmlns:w16="http://schemas.microsoft.com/office/word/2018/wordml" xmlns:w16du="http://schemas.microsoft.com/office/word/2023/wordml/word16du" xmlns:w16sdtdh="http://schemas.microsoft.com/office/word/2020/wordml/sdtdatahash" xmlns:w16sdtfl="http://schemas.microsoft.com/office/word/2024/wordml/sdtformatlock" xmlns:w16se="http://schemas.microsoft.com/office/word/2015/wordml/symex" mc:Ignorable="w14 w15 w16se w16cid w16 w16cex w16sdtdh w16sdtfl w16du">
+<w:styles xmlns:mc="http://schemas.openxmlformats.org/markup-compatibility/2006" xmlns:r="http://schemas.openxmlformats.org/officeDocument/2006/relationships" xmlns:w="http://schemas.openxmlformats.org/wordprocessingml/2006/main" xmlns:w14="http://schemas.microsoft.com/office/word/2010/wordml" xmlns:w15="http://schemas.microsoft.com/office/word/2012/wordml" xmlns:w16cex="http://schemas.microsoft.com/office/word/2018/wordml/cex" xmlns:w16cid="http://schemas.microsoft.com/office/word/2016/wordml/cid" xmlns:w16="http://schemas.microsoft.com/office/word/2018/wordml" xmlns:w16se="http://schemas.microsoft.com/office/word/2015/wordml/symex" mc:Ignorable="w14 w15 w16se w16cid w16 w16cex">
   <w:docDefaults>
     <w:rPrDefault>
       <w:rPr>
@@ -2911,6 +3808,7 @@
   <w:style w:type="character" w:default="1" w:styleId="Fuentedeprrafopredeter">
     <w:name w:val="Default Paragraph Font"/>
     <w:uiPriority w:val="1"/>
+    <w:semiHidden/>
     <w:unhideWhenUsed/>
   </w:style>
   <w:style w:type="table" w:default="1" w:styleId="Tablanormal">

</xml_diff>

<commit_message>
Ultima partedeCedrick act1 Unidad 2 no tiene computadora
</commit_message>
<xml_diff>
--- a/Actividad 1 Unidad 2 Usuario/INVESTIACION ACT 1.docx
+++ b/Actividad 1 Unidad 2 Usuario/INVESTIACION ACT 1.docx
@@ -1,7 +1,38 @@
 
 <file path=word/document.xml><?xml version="1.0" encoding="utf-8"?>
-<w:document xmlns:wpc="http://schemas.microsoft.com/office/word/2010/wordprocessingCanvas" xmlns:cx="http://schemas.microsoft.com/office/drawing/2014/chartex" xmlns:cx1="http://schemas.microsoft.com/office/drawing/2015/9/8/chartex" xmlns:cx2="http://schemas.microsoft.com/office/drawing/2015/10/21/chartex" xmlns:cx3="http://schemas.microsoft.com/office/drawing/2016/5/9/chartex" xmlns:cx4="http://schemas.microsoft.com/office/drawing/2016/5/10/chartex" xmlns:cx5="http://schemas.microsoft.com/office/drawing/2016/5/11/chartex" xmlns:cx6="http://schemas.microsoft.com/office/drawing/2016/5/12/chartex" xmlns:cx7="http://schemas.microsoft.com/office/drawing/2016/5/13/chartex" xmlns:cx8="http://schemas.microsoft.com/office/drawing/2016/5/14/chartex" xmlns:mc="http://schemas.openxmlformats.org/markup-compatibility/2006" xmlns:aink="http://schemas.microsoft.com/office/drawing/2016/ink" xmlns:am3d="http://schemas.microsoft.com/office/drawing/2017/model3d" xmlns:o="urn:schemas-microsoft-com:office:office" xmlns:r="http://schemas.openxmlformats.org/officeDocument/2006/relationships" xmlns:m="http://schemas.openxmlformats.org/officeDocument/2006/math" xmlns:v="urn:schemas-microsoft-com:vml" xmlns:wp14="http://schemas.microsoft.com/office/word/2010/wordprocessingDrawing" xmlns:wp="http://schemas.openxmlformats.org/drawingml/2006/wordprocessingDrawing" xmlns:w10="urn:schemas-microsoft-com:office:word" xmlns:w="http://schemas.openxmlformats.org/wordprocessingml/2006/main" xmlns:w14="http://schemas.microsoft.com/office/word/2010/wordml" xmlns:w15="http://schemas.microsoft.com/office/word/2012/wordml" xmlns:w16cex="http://schemas.microsoft.com/office/word/2018/wordml/cex" xmlns:w16cid="http://schemas.microsoft.com/office/word/2016/wordml/cid" xmlns:w16="http://schemas.microsoft.com/office/word/2018/wordml" xmlns:w16se="http://schemas.microsoft.com/office/word/2015/wordml/symex" xmlns:wpg="http://schemas.microsoft.com/office/word/2010/wordprocessingGroup" xmlns:wpi="http://schemas.microsoft.com/office/word/2010/wordprocessingInk" xmlns:wne="http://schemas.microsoft.com/office/word/2006/wordml" xmlns:wps="http://schemas.microsoft.com/office/word/2010/wordprocessingShape" mc:Ignorable="w14 w15 w16se w16cid w16 w16cex wp14">
+<w:document xmlns:wpc="http://schemas.microsoft.com/office/word/2010/wordprocessingCanvas" xmlns:cx="http://schemas.microsoft.com/office/drawing/2014/chartex" xmlns:cx1="http://schemas.microsoft.com/office/drawing/2015/9/8/chartex" xmlns:cx2="http://schemas.microsoft.com/office/drawing/2015/10/21/chartex" xmlns:cx3="http://schemas.microsoft.com/office/drawing/2016/5/9/chartex" xmlns:cx4="http://schemas.microsoft.com/office/drawing/2016/5/10/chartex" xmlns:cx5="http://schemas.microsoft.com/office/drawing/2016/5/11/chartex" xmlns:cx6="http://schemas.microsoft.com/office/drawing/2016/5/12/chartex" xmlns:cx7="http://schemas.microsoft.com/office/drawing/2016/5/13/chartex" xmlns:cx8="http://schemas.microsoft.com/office/drawing/2016/5/14/chartex" xmlns:mc="http://schemas.openxmlformats.org/markup-compatibility/2006" xmlns:aink="http://schemas.microsoft.com/office/drawing/2016/ink" xmlns:am3d="http://schemas.microsoft.com/office/drawing/2017/model3d" xmlns:o="urn:schemas-microsoft-com:office:office" xmlns:oel="http://schemas.microsoft.com/office/2019/extlst" xmlns:r="http://schemas.openxmlformats.org/officeDocument/2006/relationships" xmlns:m="http://schemas.openxmlformats.org/officeDocument/2006/math" xmlns:v="urn:schemas-microsoft-com:vml" xmlns:wp14="http://schemas.microsoft.com/office/word/2010/wordprocessingDrawing" xmlns:wp="http://schemas.openxmlformats.org/drawingml/2006/wordprocessingDrawing" xmlns:w10="urn:schemas-microsoft-com:office:word" xmlns:w="http://schemas.openxmlformats.org/wordprocessingml/2006/main" xmlns:w14="http://schemas.microsoft.com/office/word/2010/wordml" xmlns:w15="http://schemas.microsoft.com/office/word/2012/wordml" xmlns:w16cex="http://schemas.microsoft.com/office/word/2018/wordml/cex" xmlns:w16cid="http://schemas.microsoft.com/office/word/2016/wordml/cid" xmlns:w16="http://schemas.microsoft.com/office/word/2018/wordml" xmlns:w16du="http://schemas.microsoft.com/office/word/2023/wordml/word16du" xmlns:w16sdtdh="http://schemas.microsoft.com/office/word/2020/wordml/sdtdatahash" xmlns:w16se="http://schemas.microsoft.com/office/word/2015/wordml/symex" xmlns:wpg="http://schemas.microsoft.com/office/word/2010/wordprocessingGroup" xmlns:wpi="http://schemas.microsoft.com/office/word/2010/wordprocessingInk" xmlns:wne="http://schemas.microsoft.com/office/word/2006/wordml" xmlns:wps="http://schemas.microsoft.com/office/word/2010/wordprocessingShape" mc:Ignorable="w14 w15 w16se w16cid w16 w16cex w16sdtdh w16du wp14">
   <w:body>
+    <w:p>
+      <w:pPr>
+        <w:spacing w:after="0" w:line="240" w:lineRule="auto"/>
+        <w:outlineLvl w:val="0"/>
+        <w:rPr>
+          <w:rFonts w:ascii="Arial" w:eastAsia="Times New Roman" w:hAnsi="Arial" w:cs="Arial"/>
+          <w:b/>
+          <w:bCs/>
+          <w:color w:val="1F1F1F"/>
+          <w:kern w:val="36"/>
+          <w:sz w:val="44"/>
+          <w:szCs w:val="44"/>
+          <w:lang w:eastAsia="es-MX"/>
+          <w14:ligatures w14:val="none"/>
+        </w:rPr>
+      </w:pPr>
+      <w:r>
+        <w:rPr>
+          <w:rFonts w:ascii="Arial" w:eastAsia="Times New Roman" w:hAnsi="Arial" w:cs="Arial"/>
+          <w:b/>
+          <w:bCs/>
+          <w:color w:val="1F1F1F"/>
+          <w:kern w:val="36"/>
+          <w:sz w:val="44"/>
+          <w:szCs w:val="44"/>
+          <w:lang w:eastAsia="es-MX"/>
+          <w14:ligatures w14:val="none"/>
+        </w:rPr>
+        <w:t>5iv12</w:t>
+      </w:r>
+    </w:p>
     <w:p>
       <w:pPr>
         <w:spacing w:after="0" w:line="240" w:lineRule="auto"/>
@@ -1134,6 +1165,7 @@
           <w:lang w:eastAsia="es-MX"/>
           <w14:ligatures w14:val="none"/>
         </w:rPr>
+        <w:lastRenderedPageBreak/>
         <w:t xml:space="preserve">La calidad no es un atributo único, sino una combinación de características medibles descritas en estándares internacionales de ingeniería de software (como las normas </w:t>
       </w:r>
       <w:r>
@@ -1147,7 +1179,6 @@
           <w:lang w:eastAsia="es-MX"/>
           <w14:ligatures w14:val="none"/>
         </w:rPr>
-        <w:lastRenderedPageBreak/>
         <w:t>ISO/IEC 25010</w:t>
       </w:r>
       <w:r>
@@ -2120,23 +2151,7 @@
           <w:i/>
           <w:iCs/>
         </w:rPr>
-        <w:t xml:space="preserve"> </w:t>
-      </w:r>
-      <w:proofErr w:type="spellStart"/>
-      <w:r>
-        <w:rPr>
-          <w:i/>
-          <w:iCs/>
-        </w:rPr>
-        <w:t>interactive</w:t>
-      </w:r>
-      <w:proofErr w:type="spellEnd"/>
-      <w:r>
-        <w:rPr>
-          <w:i/>
-          <w:iCs/>
-        </w:rPr>
-        <w:t xml:space="preserve"> </w:t>
+        <w:t xml:space="preserve"> interactive </w:t>
       </w:r>
       <w:proofErr w:type="spellStart"/>
       <w:r>
@@ -2177,6 +2192,7 @@
         </w:numPr>
       </w:pPr>
       <w:r>
+        <w:lastRenderedPageBreak/>
         <w:t>La participación activa de los usuarios y una clara comprensión de los requisitos de usuario y de tarea.</w:t>
       </w:r>
     </w:p>
@@ -2199,7 +2215,6 @@
         </w:numPr>
       </w:pPr>
       <w:r>
-        <w:lastRenderedPageBreak/>
         <w:t>El diseño iterativo (probar, evaluar y corregir de manera constante).</w:t>
       </w:r>
     </w:p>
@@ -2387,11 +2402,36 @@
       <w:pPr>
         <w:rPr>
           <w:rFonts w:asciiTheme="majorHAnsi" w:hAnsiTheme="majorHAnsi"/>
-          <w:color w:val="4472C4" w:themeColor="accent1"/>
+          <w:color w:val="000000" w:themeColor="text1"/>
           <w:sz w:val="28"/>
           <w:szCs w:val="28"/>
         </w:rPr>
       </w:pPr>
+      <w:r>
+        <w:rPr>
+          <w:rFonts w:asciiTheme="majorHAnsi" w:hAnsiTheme="majorHAnsi"/>
+          <w:color w:val="000000" w:themeColor="text1"/>
+          <w:sz w:val="28"/>
+          <w:szCs w:val="28"/>
+        </w:rPr>
+        <w:t>METODOS DE DCU</w:t>
+      </w:r>
+    </w:p>
+    <w:p>
+      <w:pPr>
+        <w:rPr>
+          <w:color w:val="000000" w:themeColor="text1"/>
+        </w:rPr>
+      </w:pPr>
+      <w:r>
+        <w:rPr>
+          <w:rFonts w:asciiTheme="majorHAnsi" w:hAnsiTheme="majorHAnsi"/>
+          <w:color w:val="000000" w:themeColor="text1"/>
+          <w:sz w:val="28"/>
+          <w:szCs w:val="28"/>
+        </w:rPr>
+        <w:t>•</w:t>
+      </w:r>
       <w:r>
         <w:rPr>
           <w:rFonts w:asciiTheme="majorHAnsi" w:hAnsiTheme="majorHAnsi"/>
@@ -2399,32 +2439,6 @@
           <w:sz w:val="28"/>
           <w:szCs w:val="28"/>
         </w:rPr>
-        <w:t>METODOS DE DCU</w:t>
-      </w:r>
-    </w:p>
-    <w:p>
-      <w:pPr>
-        <w:rPr>
-          <w:color w:val="000000" w:themeColor="text1"/>
-        </w:rPr>
-      </w:pPr>
-      <w:r>
-        <w:rPr>
-          <w:rFonts w:asciiTheme="majorHAnsi" w:hAnsiTheme="majorHAnsi"/>
-          <w:color w:val="000000" w:themeColor="text1"/>
-          <w:sz w:val="28"/>
-          <w:szCs w:val="28"/>
-        </w:rPr>
-        <w:lastRenderedPageBreak/>
-        <w:t>•</w:t>
-      </w:r>
-      <w:r>
-        <w:rPr>
-          <w:rFonts w:asciiTheme="majorHAnsi" w:hAnsiTheme="majorHAnsi"/>
-          <w:color w:val="4472C4" w:themeColor="accent1"/>
-          <w:sz w:val="28"/>
-          <w:szCs w:val="28"/>
-        </w:rPr>
         <w:t xml:space="preserve"> </w:t>
       </w:r>
       <w:r>
@@ -2672,6 +2686,466 @@
         </w:rPr>
         <w:t xml:space="preserve"> importantes.</w:t>
       </w:r>
+    </w:p>
+    <w:p>
+      <w:pPr>
+        <w:rPr>
+          <w:color w:val="000000" w:themeColor="text1"/>
+        </w:rPr>
+      </w:pPr>
+    </w:p>
+    <w:p>
+      <w:pPr>
+        <w:rPr>
+          <w:color w:val="000000" w:themeColor="text1"/>
+        </w:rPr>
+      </w:pPr>
+    </w:p>
+    <w:p>
+      <w:pPr>
+        <w:rPr>
+          <w:color w:val="000000" w:themeColor="text1"/>
+        </w:rPr>
+      </w:pPr>
+    </w:p>
+    <w:p>
+      <w:pPr>
+        <w:rPr>
+          <w:color w:val="000000" w:themeColor="text1"/>
+        </w:rPr>
+      </w:pPr>
+    </w:p>
+    <w:p>
+      <w:pPr>
+        <w:rPr>
+          <w:color w:val="000000" w:themeColor="text1"/>
+        </w:rPr>
+      </w:pPr>
+    </w:p>
+    <w:p>
+      <w:pPr>
+        <w:rPr>
+          <w:color w:val="000000" w:themeColor="text1"/>
+        </w:rPr>
+      </w:pPr>
+    </w:p>
+    <w:p>
+      <w:pPr>
+        <w:rPr>
+          <w:color w:val="000000" w:themeColor="text1"/>
+        </w:rPr>
+      </w:pPr>
+    </w:p>
+    <w:p>
+      <w:pPr>
+        <w:rPr>
+          <w:color w:val="000000" w:themeColor="text1"/>
+        </w:rPr>
+      </w:pPr>
+    </w:p>
+    <w:p>
+      <w:pPr>
+        <w:rPr>
+          <w:color w:val="000000" w:themeColor="text1"/>
+        </w:rPr>
+      </w:pPr>
+    </w:p>
+    <w:p>
+      <w:pPr>
+        <w:jc w:val="center"/>
+        <w:rPr>
+          <w:rFonts w:ascii="Biome" w:hAnsi="Biome" w:cs="Biome"/>
+          <w:b/>
+          <w:sz w:val="38"/>
+          <w:szCs w:val="38"/>
+        </w:rPr>
+      </w:pPr>
+      <w:r>
+        <w:rPr>
+          <w:rFonts w:ascii="Biome" w:hAnsi="Biome" w:cs="Biome"/>
+          <w:b/>
+          <w:sz w:val="38"/>
+          <w:szCs w:val="38"/>
+          <w:highlight w:val="yellow"/>
+        </w:rPr>
+        <w:lastRenderedPageBreak/>
+        <w:t xml:space="preserve">Parte de </w:t>
+      </w:r>
+      <w:proofErr w:type="spellStart"/>
+      <w:proofErr w:type="gramStart"/>
+      <w:r>
+        <w:rPr>
+          <w:rFonts w:ascii="Biome" w:hAnsi="Biome" w:cs="Biome"/>
+          <w:b/>
+          <w:sz w:val="38"/>
+          <w:szCs w:val="38"/>
+          <w:highlight w:val="yellow"/>
+        </w:rPr>
+        <w:t>Cedrick</w:t>
+      </w:r>
+      <w:proofErr w:type="spellEnd"/>
+      <w:r>
+        <w:rPr>
+          <w:rFonts w:ascii="Biome" w:hAnsi="Biome" w:cs="Biome"/>
+          <w:b/>
+          <w:sz w:val="38"/>
+          <w:szCs w:val="38"/>
+          <w:highlight w:val="yellow"/>
+        </w:rPr>
+        <w:t>(</w:t>
+      </w:r>
+      <w:proofErr w:type="gramEnd"/>
+      <w:r>
+        <w:rPr>
+          <w:rFonts w:ascii="Biome" w:hAnsi="Biome" w:cs="Biome"/>
+          <w:b/>
+          <w:sz w:val="38"/>
+          <w:szCs w:val="38"/>
+          <w:highlight w:val="yellow"/>
+        </w:rPr>
+        <w:t>no tiene computadora)</w:t>
+      </w:r>
+    </w:p>
+    <w:p>
+      <w:pPr>
+        <w:jc w:val="center"/>
+        <w:rPr>
+          <w:rFonts w:ascii="Biome" w:hAnsi="Biome" w:cs="Biome"/>
+          <w:color w:val="000000" w:themeColor="text1"/>
+        </w:rPr>
+      </w:pPr>
+      <w:r>
+        <w:rPr>
+          <w:rFonts w:ascii="Biome" w:hAnsi="Biome" w:cs="Biome"/>
+          <w:b/>
+          <w:color w:val="000000" w:themeColor="text1"/>
+          <w:sz w:val="38"/>
+          <w:szCs w:val="38"/>
+        </w:rPr>
+        <w:t>Integración del Mapa Conceptual y Conclusiones</w:t>
+      </w:r>
+    </w:p>
+    <w:p>
+      <w:pPr>
+        <w:jc w:val="center"/>
+        <w:rPr>
+          <w:rFonts w:ascii="Biome" w:hAnsi="Biome" w:cs="Biome"/>
+        </w:rPr>
+      </w:pPr>
+      <w:r>
+        <w:rPr>
+          <w:rFonts w:ascii="Biome" w:hAnsi="Biome" w:cs="Biome"/>
+          <w:i/>
+        </w:rPr>
+        <w:t>Diseño Centrado en el Usuario (DCU) y su aplicación en la Plataforma de Guías de Estudio para el CECyT 5</w:t>
+      </w:r>
+    </w:p>
+    <w:p>
+      <w:pPr>
+        <w:rPr>
+          <w:rFonts w:ascii="Biome" w:hAnsi="Biome" w:cs="Biome"/>
+        </w:rPr>
+      </w:pPr>
+      <w:r>
+        <w:rPr>
+          <w:rFonts w:ascii="Biome" w:hAnsi="Biome" w:cs="Biome"/>
+        </w:rPr>
+        <w:t xml:space="preserve"> </w:t>
+      </w:r>
+    </w:p>
+    <w:p>
+      <w:pPr>
+        <w:pStyle w:val="Ttulo1"/>
+        <w:rPr>
+          <w:rFonts w:ascii="Biome" w:hAnsi="Biome" w:cs="Biome"/>
+          <w:color w:val="000000" w:themeColor="text1"/>
+        </w:rPr>
+      </w:pPr>
+      <w:r>
+        <w:rPr>
+          <w:rFonts w:ascii="Biome" w:hAnsi="Biome" w:cs="Biome"/>
+          <w:color w:val="000000" w:themeColor="text1"/>
+        </w:rPr>
+        <w:t>Mapa conceptual</w:t>
+      </w:r>
+    </w:p>
+    <w:p>
+      <w:pPr>
+        <w:jc w:val="center"/>
+        <w:rPr>
+          <w:rFonts w:ascii="Biome" w:hAnsi="Biome" w:cs="Biome"/>
+          <w:kern w:val="0"/>
+        </w:rPr>
+      </w:pPr>
+      <w:r>
+        <w:rPr>
+          <w:noProof/>
+        </w:rPr>
+        <w:drawing>
+          <wp:inline distT="0" distB="0" distL="0" distR="0" wp14:anchorId="2020906D" wp14:editId="39C2268D">
+            <wp:extent cx="5612130" cy="3747135"/>
+            <wp:effectExtent l="0" t="0" r="7620" b="5715"/>
+            <wp:docPr id="1764294693" name="Imagen 1"/>
+            <wp:cNvGraphicFramePr>
+              <a:graphicFrameLocks xmlns:a="http://schemas.openxmlformats.org/drawingml/2006/main" noChangeAspect="1"/>
+            </wp:cNvGraphicFramePr>
+            <a:graphic xmlns:a="http://schemas.openxmlformats.org/drawingml/2006/main">
+              <a:graphicData uri="http://schemas.openxmlformats.org/drawingml/2006/picture">
+                <pic:pic xmlns:pic="http://schemas.openxmlformats.org/drawingml/2006/picture">
+                  <pic:nvPicPr>
+                    <pic:cNvPr id="0" name="Picture 1"/>
+                    <pic:cNvPicPr>
+                      <a:picLocks noChangeAspect="1" noChangeArrowheads="1"/>
+                    </pic:cNvPicPr>
+                  </pic:nvPicPr>
+                  <pic:blipFill>
+                    <a:blip r:embed="rId5">
+                      <a:extLst>
+                        <a:ext uri="{28A0092B-C50C-407E-A947-70E740481C1C}">
+                          <a14:useLocalDpi xmlns:a14="http://schemas.microsoft.com/office/drawing/2010/main" val="0"/>
+                        </a:ext>
+                      </a:extLst>
+                    </a:blip>
+                    <a:srcRect/>
+                    <a:stretch>
+                      <a:fillRect/>
+                    </a:stretch>
+                  </pic:blipFill>
+                  <pic:spPr bwMode="auto">
+                    <a:xfrm>
+                      <a:off x="0" y="0"/>
+                      <a:ext cx="5612130" cy="3747135"/>
+                    </a:xfrm>
+                    <a:prstGeom prst="rect">
+                      <a:avLst/>
+                    </a:prstGeom>
+                    <a:noFill/>
+                    <a:ln>
+                      <a:noFill/>
+                    </a:ln>
+                  </pic:spPr>
+                </pic:pic>
+              </a:graphicData>
+            </a:graphic>
+          </wp:inline>
+        </w:drawing>
+      </w:r>
+      <w:r>
+        <w:rPr>
+          <w:rFonts w:ascii="Biome" w:hAnsi="Biome" w:cs="Biome"/>
+        </w:rPr>
+        <w:t xml:space="preserve"> </w:t>
+      </w:r>
+    </w:p>
+    <w:p>
+      <w:pPr>
+        <w:rPr>
+          <w:rFonts w:ascii="Biome" w:hAnsi="Biome" w:cs="Biome"/>
+        </w:rPr>
+      </w:pPr>
+      <w:r>
+        <w:rPr>
+          <w:rFonts w:ascii="Biome" w:hAnsi="Biome" w:cs="Biome"/>
+        </w:rPr>
+        <w:br w:type="page"/>
+      </w:r>
+    </w:p>
+    <w:p>
+      <w:pPr>
+        <w:pStyle w:val="Ttulo1"/>
+        <w:rPr>
+          <w:rFonts w:ascii="Biome" w:hAnsi="Biome" w:cs="Biome"/>
+          <w:color w:val="000000" w:themeColor="text1"/>
+        </w:rPr>
+      </w:pPr>
+      <w:r>
+        <w:rPr>
+          <w:rFonts w:ascii="Biome" w:hAnsi="Biome" w:cs="Biome"/>
+          <w:color w:val="000000" w:themeColor="text1"/>
+        </w:rPr>
+        <w:lastRenderedPageBreak/>
+        <w:t>Conclusiones</w:t>
+      </w:r>
+    </w:p>
+    <w:p>
+      <w:pPr>
+        <w:rPr>
+          <w:rFonts w:ascii="Biome" w:hAnsi="Biome" w:cs="Biome"/>
+          <w:kern w:val="0"/>
+        </w:rPr>
+      </w:pPr>
+      <w:r>
+        <w:rPr>
+          <w:rFonts w:ascii="Biome" w:hAnsi="Biome" w:cs="Biome"/>
+        </w:rPr>
+        <w:t>El Diseño Centrado en el Usuario (DCU) permite desarrollar sistemas que respondan a las necesidades reales de las personas. Mediante la investigación, la ideación, el diseño, el desarrollo y la evaluación, es posible identificar problemas y crear soluciones que sean útiles, accesibles y fáciles de utilizar.</w:t>
+      </w:r>
+    </w:p>
+    <w:p>
+      <w:pPr>
+        <w:rPr>
+          <w:rFonts w:ascii="Biome" w:hAnsi="Biome" w:cs="Biome"/>
+        </w:rPr>
+      </w:pPr>
+      <w:r>
+        <w:rPr>
+          <w:rFonts w:ascii="Biome" w:hAnsi="Biome" w:cs="Biome"/>
+        </w:rPr>
+        <w:t>En el caso de la Plataforma de Guías de Estudio para el CECyT 5, la aplicación del DCU permite conocer las dificultades académicas de los estudiantes y diseñar una herramienta que facilite la consulta, publicación y organización de materiales de estudio. Para lograrlo, es importante considerar los hábitos digitales de los usuarios, sus conocimientos técnicos y las necesidades que presentan al utilizar una plataforma.</w:t>
+      </w:r>
+    </w:p>
+    <w:p>
+      <w:pPr>
+        <w:rPr>
+          <w:rFonts w:ascii="Biome" w:hAnsi="Biome" w:cs="Biome"/>
+        </w:rPr>
+      </w:pPr>
+      <w:r>
+        <w:rPr>
+          <w:rFonts w:ascii="Biome" w:hAnsi="Biome" w:cs="Biome"/>
+        </w:rPr>
+        <w:t>Asimismo, los métodos de investigación, como las encuestas y entrevistas, junto con las pruebas de usabilidad, permiten recopilar información, detectar errores y realizar mejoras durante el desarrollo. Esto ayuda a que la plataforma tenga una estructura clara, funcione correctamente en dispositivos móviles y facilite el acceso a los recursos académicos.</w:t>
+      </w:r>
+    </w:p>
+    <w:p>
+      <w:pPr>
+        <w:rPr>
+          <w:rFonts w:ascii="Biome" w:hAnsi="Biome" w:cs="Biome"/>
+        </w:rPr>
+      </w:pPr>
+      <w:r>
+        <w:rPr>
+          <w:rFonts w:ascii="Biome" w:hAnsi="Biome" w:cs="Biome"/>
+        </w:rPr>
+        <w:t>Finalmente, la calidad del sistema y la experiencia del usuario están relacionadas, ya que una plataforma bien organizada, funcional y fácil de utilizar puede mejorar la interacción de los estudiantes con los materiales educativos. Por ello, aplicar el Diseño Centrado en el Usuario permite orientar el desarrollo de la plataforma hacia una solución colaborativa que responda a las necesidades de la comunidad estudiantil del CECyT 5.</w:t>
+      </w:r>
+    </w:p>
+    <w:p>
+      <w:pPr>
+        <w:pStyle w:val="Ttulo1"/>
+        <w:rPr>
+          <w:rFonts w:ascii="Biome" w:hAnsi="Biome" w:cs="Biome"/>
+          <w:color w:val="000000" w:themeColor="text1"/>
+        </w:rPr>
+      </w:pPr>
+      <w:r>
+        <w:rPr>
+          <w:rFonts w:ascii="Biome" w:hAnsi="Biome" w:cs="Biome"/>
+          <w:color w:val="000000" w:themeColor="text1"/>
+        </w:rPr>
+        <w:t>Relación entre los conceptos principales</w:t>
+      </w:r>
+    </w:p>
+    <w:p>
+      <w:pPr>
+        <w:pStyle w:val="Listaconvietas"/>
+        <w:numPr>
+          <w:ilvl w:val="0"/>
+          <w:numId w:val="5"/>
+        </w:numPr>
+        <w:tabs>
+          <w:tab w:val="left" w:pos="360"/>
+        </w:tabs>
+        <w:rPr>
+          <w:rFonts w:ascii="Biome" w:hAnsi="Biome" w:cs="Biome"/>
+        </w:rPr>
+      </w:pPr>
+      <w:r>
+        <w:rPr>
+          <w:rFonts w:ascii="Biome" w:hAnsi="Biome" w:cs="Biome"/>
+          <w:b/>
+        </w:rPr>
+        <w:t xml:space="preserve">Diseño Centrado en el Usuario (DCU): </w:t>
+      </w:r>
+      <w:r>
+        <w:rPr>
+          <w:rFonts w:ascii="Biome" w:hAnsi="Biome" w:cs="Biome"/>
+        </w:rPr>
+        <w:t>permite conocer las necesidades de los estudiantes y orientar el desarrollo de la plataforma.</w:t>
+      </w:r>
+    </w:p>
+    <w:p>
+      <w:pPr>
+        <w:pStyle w:val="Listaconvietas"/>
+        <w:numPr>
+          <w:ilvl w:val="0"/>
+          <w:numId w:val="5"/>
+        </w:numPr>
+        <w:tabs>
+          <w:tab w:val="left" w:pos="360"/>
+        </w:tabs>
+        <w:rPr>
+          <w:rFonts w:ascii="Biome" w:hAnsi="Biome" w:cs="Biome"/>
+        </w:rPr>
+      </w:pPr>
+      <w:r>
+        <w:rPr>
+          <w:rFonts w:ascii="Biome" w:hAnsi="Biome" w:cs="Biome"/>
+          <w:b/>
+        </w:rPr>
+        <w:t xml:space="preserve">Calidad del sistema: </w:t>
+      </w:r>
+      <w:r>
+        <w:rPr>
+          <w:rFonts w:ascii="Biome" w:hAnsi="Biome" w:cs="Biome"/>
+        </w:rPr>
+        <w:t>se relaciona con la funcionalidad, la organización de la información y la compatibilidad con distintos dispositivos.</w:t>
+      </w:r>
+    </w:p>
+    <w:p>
+      <w:pPr>
+        <w:pStyle w:val="Listaconvietas"/>
+        <w:numPr>
+          <w:ilvl w:val="0"/>
+          <w:numId w:val="5"/>
+        </w:numPr>
+        <w:tabs>
+          <w:tab w:val="left" w:pos="360"/>
+        </w:tabs>
+        <w:rPr>
+          <w:rFonts w:ascii="Biome" w:hAnsi="Biome" w:cs="Biome"/>
+        </w:rPr>
+      </w:pPr>
+      <w:r>
+        <w:rPr>
+          <w:rFonts w:ascii="Biome" w:hAnsi="Biome" w:cs="Biome"/>
+          <w:b/>
+        </w:rPr>
+        <w:t xml:space="preserve">Experiencia del usuario: </w:t>
+      </w:r>
+      <w:r>
+        <w:rPr>
+          <w:rFonts w:ascii="Biome" w:hAnsi="Biome" w:cs="Biome"/>
+        </w:rPr>
+        <w:t>depende de qué tan fácil y claro resulte consultar, publicar y encontrar guías de estudio.</w:t>
+      </w:r>
+    </w:p>
+    <w:p>
+      <w:pPr>
+        <w:rPr>
+          <w:rFonts w:ascii="Biome" w:hAnsi="Biome" w:cs="Biome"/>
+        </w:rPr>
+      </w:pPr>
+      <w:r>
+        <w:rPr>
+          <w:rFonts w:ascii="Biome" w:hAnsi="Biome" w:cs="Biome"/>
+          <w:b/>
+        </w:rPr>
+        <w:t xml:space="preserve">Relación principal: </w:t>
+      </w:r>
+      <w:r>
+        <w:rPr>
+          <w:rFonts w:ascii="Biome" w:hAnsi="Biome" w:cs="Biome"/>
+        </w:rPr>
+        <w:t>el DCU ayuda a mejorar la calidad del sistema y, al responder a las necesidades de los estudiantes, favorece una mejor experiencia de usuario.</w:t>
+      </w:r>
+    </w:p>
+    <w:p>
+      <w:pPr>
+        <w:rPr>
+          <w:color w:val="000000" w:themeColor="text1"/>
+        </w:rPr>
+      </w:pPr>
     </w:p>
     <w:p>
       <w:pPr>
@@ -2703,7 +3177,7 @@
 </file>
 
 <file path=word/numbering.xml><?xml version="1.0" encoding="utf-8"?>
-<w:numbering xmlns:wpc="http://schemas.microsoft.com/office/word/2010/wordprocessingCanvas" xmlns:cx="http://schemas.microsoft.com/office/drawing/2014/chartex" xmlns:cx1="http://schemas.microsoft.com/office/drawing/2015/9/8/chartex" xmlns:cx2="http://schemas.microsoft.com/office/drawing/2015/10/21/chartex" xmlns:cx3="http://schemas.microsoft.com/office/drawing/2016/5/9/chartex" xmlns:cx4="http://schemas.microsoft.com/office/drawing/2016/5/10/chartex" xmlns:cx5="http://schemas.microsoft.com/office/drawing/2016/5/11/chartex" xmlns:cx6="http://schemas.microsoft.com/office/drawing/2016/5/12/chartex" xmlns:cx7="http://schemas.microsoft.com/office/drawing/2016/5/13/chartex" xmlns:cx8="http://schemas.microsoft.com/office/drawing/2016/5/14/chartex" xmlns:mc="http://schemas.openxmlformats.org/markup-compatibility/2006" xmlns:aink="http://schemas.microsoft.com/office/drawing/2016/ink" xmlns:am3d="http://schemas.microsoft.com/office/drawing/2017/model3d" xmlns:o="urn:schemas-microsoft-com:office:office" xmlns:r="http://schemas.openxmlformats.org/officeDocument/2006/relationships" xmlns:m="http://schemas.openxmlformats.org/officeDocument/2006/math" xmlns:v="urn:schemas-microsoft-com:vml" xmlns:wp14="http://schemas.microsoft.com/office/word/2010/wordprocessingDrawing" xmlns:wp="http://schemas.openxmlformats.org/drawingml/2006/wordprocessingDrawing" xmlns:w10="urn:schemas-microsoft-com:office:word" xmlns:w="http://schemas.openxmlformats.org/wordprocessingml/2006/main" xmlns:w14="http://schemas.microsoft.com/office/word/2010/wordml" xmlns:w15="http://schemas.microsoft.com/office/word/2012/wordml" xmlns:w16cex="http://schemas.microsoft.com/office/word/2018/wordml/cex" xmlns:w16cid="http://schemas.microsoft.com/office/word/2016/wordml/cid" xmlns:w16="http://schemas.microsoft.com/office/word/2018/wordml" xmlns:w16se="http://schemas.microsoft.com/office/word/2015/wordml/symex" xmlns:wpg="http://schemas.microsoft.com/office/word/2010/wordprocessingGroup" xmlns:wpi="http://schemas.microsoft.com/office/word/2010/wordprocessingInk" xmlns:wne="http://schemas.microsoft.com/office/word/2006/wordml" xmlns:wps="http://schemas.microsoft.com/office/word/2010/wordprocessingShape" mc:Ignorable="w14 w15 w16se w16cid w16 w16cex wp14">
+<w:numbering xmlns:wpc="http://schemas.microsoft.com/office/word/2010/wordprocessingCanvas" xmlns:cx="http://schemas.microsoft.com/office/drawing/2014/chartex" xmlns:cx1="http://schemas.microsoft.com/office/drawing/2015/9/8/chartex" xmlns:cx2="http://schemas.microsoft.com/office/drawing/2015/10/21/chartex" xmlns:cx3="http://schemas.microsoft.com/office/drawing/2016/5/9/chartex" xmlns:cx4="http://schemas.microsoft.com/office/drawing/2016/5/10/chartex" xmlns:cx5="http://schemas.microsoft.com/office/drawing/2016/5/11/chartex" xmlns:cx6="http://schemas.microsoft.com/office/drawing/2016/5/12/chartex" xmlns:cx7="http://schemas.microsoft.com/office/drawing/2016/5/13/chartex" xmlns:cx8="http://schemas.microsoft.com/office/drawing/2016/5/14/chartex" xmlns:mc="http://schemas.openxmlformats.org/markup-compatibility/2006" xmlns:aink="http://schemas.microsoft.com/office/drawing/2016/ink" xmlns:am3d="http://schemas.microsoft.com/office/drawing/2017/model3d" xmlns:o="urn:schemas-microsoft-com:office:office" xmlns:oel="http://schemas.microsoft.com/office/2019/extlst" xmlns:r="http://schemas.openxmlformats.org/officeDocument/2006/relationships" xmlns:m="http://schemas.openxmlformats.org/officeDocument/2006/math" xmlns:v="urn:schemas-microsoft-com:vml" xmlns:wp14="http://schemas.microsoft.com/office/word/2010/wordprocessingDrawing" xmlns:wp="http://schemas.openxmlformats.org/drawingml/2006/wordprocessingDrawing" xmlns:w10="urn:schemas-microsoft-com:office:word" xmlns:w="http://schemas.openxmlformats.org/wordprocessingml/2006/main" xmlns:w14="http://schemas.microsoft.com/office/word/2010/wordml" xmlns:w15="http://schemas.microsoft.com/office/word/2012/wordml" xmlns:w16cex="http://schemas.microsoft.com/office/word/2018/wordml/cex" xmlns:w16cid="http://schemas.microsoft.com/office/word/2016/wordml/cid" xmlns:w16="http://schemas.microsoft.com/office/word/2018/wordml" xmlns:w16du="http://schemas.microsoft.com/office/word/2023/wordml/word16du" xmlns:w16sdtdh="http://schemas.microsoft.com/office/word/2020/wordml/sdtdatahash" xmlns:w16se="http://schemas.microsoft.com/office/word/2015/wordml/symex" xmlns:wpg="http://schemas.microsoft.com/office/word/2010/wordprocessingGroup" xmlns:wpi="http://schemas.microsoft.com/office/word/2010/wordprocessingInk" xmlns:wne="http://schemas.microsoft.com/office/word/2006/wordml" xmlns:wps="http://schemas.microsoft.com/office/word/2010/wordprocessingShape" mc:Ignorable="w14 w15 w16se w16cid w16 w16cex w16sdtdh w16du wp14">
   <w:abstractNum w:abstractNumId="0" w15:restartNumberingAfterBreak="0">
     <w:nsid w:val="23883E91"/>
     <w:multiLevelType w:val="multilevel"/>
@@ -3003,6 +3477,122 @@
     </w:lvl>
   </w:abstractNum>
   <w:abstractNum w:abstractNumId="2" w15:restartNumberingAfterBreak="0">
+    <w:nsid w:val="5E2D3C3B"/>
+    <w:multiLevelType w:val="multilevel"/>
+    <w:tmpl w:val="A798FD00"/>
+    <w:lvl w:ilvl="0">
+      <w:start w:val="1"/>
+      <w:numFmt w:val="bullet"/>
+      <w:lvlText w:val=""/>
+      <w:lvlJc w:val="left"/>
+      <w:pPr>
+        <w:tabs>
+          <w:tab w:val="num" w:pos="360"/>
+        </w:tabs>
+        <w:ind w:left="360" w:hanging="360"/>
+      </w:pPr>
+      <w:rPr>
+        <w:rFonts w:ascii="Symbol" w:hAnsi="Symbol" w:hint="default"/>
+      </w:rPr>
+    </w:lvl>
+    <w:lvl w:ilvl="1">
+      <w:start w:val="1"/>
+      <w:numFmt w:val="decimal"/>
+      <w:lvlText w:val="%2."/>
+      <w:lvlJc w:val="left"/>
+      <w:pPr>
+        <w:tabs>
+          <w:tab w:val="num" w:pos="1440"/>
+        </w:tabs>
+        <w:ind w:left="1440" w:hanging="360"/>
+      </w:pPr>
+    </w:lvl>
+    <w:lvl w:ilvl="2">
+      <w:start w:val="1"/>
+      <w:numFmt w:val="decimal"/>
+      <w:lvlText w:val="%3."/>
+      <w:lvlJc w:val="left"/>
+      <w:pPr>
+        <w:tabs>
+          <w:tab w:val="num" w:pos="2160"/>
+        </w:tabs>
+        <w:ind w:left="2160" w:hanging="360"/>
+      </w:pPr>
+    </w:lvl>
+    <w:lvl w:ilvl="3">
+      <w:start w:val="1"/>
+      <w:numFmt w:val="decimal"/>
+      <w:lvlText w:val="%4."/>
+      <w:lvlJc w:val="left"/>
+      <w:pPr>
+        <w:tabs>
+          <w:tab w:val="num" w:pos="2880"/>
+        </w:tabs>
+        <w:ind w:left="2880" w:hanging="360"/>
+      </w:pPr>
+    </w:lvl>
+    <w:lvl w:ilvl="4">
+      <w:start w:val="1"/>
+      <w:numFmt w:val="decimal"/>
+      <w:lvlText w:val="%5."/>
+      <w:lvlJc w:val="left"/>
+      <w:pPr>
+        <w:tabs>
+          <w:tab w:val="num" w:pos="3600"/>
+        </w:tabs>
+        <w:ind w:left="3600" w:hanging="360"/>
+      </w:pPr>
+    </w:lvl>
+    <w:lvl w:ilvl="5">
+      <w:start w:val="1"/>
+      <w:numFmt w:val="decimal"/>
+      <w:lvlText w:val="%6."/>
+      <w:lvlJc w:val="left"/>
+      <w:pPr>
+        <w:tabs>
+          <w:tab w:val="num" w:pos="4320"/>
+        </w:tabs>
+        <w:ind w:left="4320" w:hanging="360"/>
+      </w:pPr>
+    </w:lvl>
+    <w:lvl w:ilvl="6">
+      <w:start w:val="1"/>
+      <w:numFmt w:val="decimal"/>
+      <w:lvlText w:val="%7."/>
+      <w:lvlJc w:val="left"/>
+      <w:pPr>
+        <w:tabs>
+          <w:tab w:val="num" w:pos="5040"/>
+        </w:tabs>
+        <w:ind w:left="5040" w:hanging="360"/>
+      </w:pPr>
+    </w:lvl>
+    <w:lvl w:ilvl="7">
+      <w:start w:val="1"/>
+      <w:numFmt w:val="decimal"/>
+      <w:lvlText w:val="%8."/>
+      <w:lvlJc w:val="left"/>
+      <w:pPr>
+        <w:tabs>
+          <w:tab w:val="num" w:pos="5760"/>
+        </w:tabs>
+        <w:ind w:left="5760" w:hanging="360"/>
+      </w:pPr>
+    </w:lvl>
+    <w:lvl w:ilvl="8">
+      <w:start w:val="1"/>
+      <w:numFmt w:val="decimal"/>
+      <w:lvlText w:val="%9."/>
+      <w:lvlJc w:val="left"/>
+      <w:pPr>
+        <w:tabs>
+          <w:tab w:val="num" w:pos="6480"/>
+        </w:tabs>
+        <w:ind w:left="6480" w:hanging="360"/>
+      </w:pPr>
+    </w:lvl>
+  </w:abstractNum>
+  <w:abstractNum w:abstractNumId="3" w15:restartNumberingAfterBreak="0">
     <w:nsid w:val="7793268A"/>
     <w:multiLevelType w:val="multilevel"/>
     <w:tmpl w:val="7AFCACDC"/>
@@ -3151,7 +3741,7 @@
       </w:rPr>
     </w:lvl>
   </w:abstractNum>
-  <w:abstractNum w:abstractNumId="3" w15:restartNumberingAfterBreak="0">
+  <w:abstractNum w:abstractNumId="4" w15:restartNumberingAfterBreak="0">
     <w:nsid w:val="787A339E"/>
     <w:multiLevelType w:val="multilevel"/>
     <w:tmpl w:val="DFA413A2"/>
@@ -3300,23 +3890,51 @@
       </w:rPr>
     </w:lvl>
   </w:abstractNum>
-  <w:num w:numId="1">
-    <w:abstractNumId w:val="2"/>
-  </w:num>
-  <w:num w:numId="2">
+  <w:num w:numId="1" w16cid:durableId="312948504">
     <w:abstractNumId w:val="3"/>
   </w:num>
-  <w:num w:numId="3">
+  <w:num w:numId="2" w16cid:durableId="59984918">
+    <w:abstractNumId w:val="4"/>
+  </w:num>
+  <w:num w:numId="3" w16cid:durableId="834153137">
     <w:abstractNumId w:val="1"/>
   </w:num>
-  <w:num w:numId="4">
+  <w:num w:numId="4" w16cid:durableId="668950854">
     <w:abstractNumId w:val="0"/>
+  </w:num>
+  <w:num w:numId="5" w16cid:durableId="1515069988">
+    <w:abstractNumId w:val="2"/>
+    <w:lvlOverride w:ilvl="0"/>
+    <w:lvlOverride w:ilvl="1">
+      <w:startOverride w:val="1"/>
+    </w:lvlOverride>
+    <w:lvlOverride w:ilvl="2">
+      <w:startOverride w:val="1"/>
+    </w:lvlOverride>
+    <w:lvlOverride w:ilvl="3">
+      <w:startOverride w:val="1"/>
+    </w:lvlOverride>
+    <w:lvlOverride w:ilvl="4">
+      <w:startOverride w:val="1"/>
+    </w:lvlOverride>
+    <w:lvlOverride w:ilvl="5">
+      <w:startOverride w:val="1"/>
+    </w:lvlOverride>
+    <w:lvlOverride w:ilvl="6">
+      <w:startOverride w:val="1"/>
+    </w:lvlOverride>
+    <w:lvlOverride w:ilvl="7">
+      <w:startOverride w:val="1"/>
+    </w:lvlOverride>
+    <w:lvlOverride w:ilvl="8">
+      <w:startOverride w:val="1"/>
+    </w:lvlOverride>
   </w:num>
 </w:numbering>
 </file>
 
 <file path=word/styles.xml><?xml version="1.0" encoding="utf-8"?>
-<w:styles xmlns:mc="http://schemas.openxmlformats.org/markup-compatibility/2006" xmlns:r="http://schemas.openxmlformats.org/officeDocument/2006/relationships" xmlns:w="http://schemas.openxmlformats.org/wordprocessingml/2006/main" xmlns:w14="http://schemas.microsoft.com/office/word/2010/wordml" xmlns:w15="http://schemas.microsoft.com/office/word/2012/wordml" xmlns:w16cex="http://schemas.microsoft.com/office/word/2018/wordml/cex" xmlns:w16cid="http://schemas.microsoft.com/office/word/2016/wordml/cid" xmlns:w16="http://schemas.microsoft.com/office/word/2018/wordml" xmlns:w16se="http://schemas.microsoft.com/office/word/2015/wordml/symex" mc:Ignorable="w14 w15 w16se w16cid w16 w16cex">
+<w:styles xmlns:mc="http://schemas.openxmlformats.org/markup-compatibility/2006" xmlns:r="http://schemas.openxmlformats.org/officeDocument/2006/relationships" xmlns:w="http://schemas.openxmlformats.org/wordprocessingml/2006/main" xmlns:w14="http://schemas.microsoft.com/office/word/2010/wordml" xmlns:w15="http://schemas.microsoft.com/office/word/2012/wordml" xmlns:w16cex="http://schemas.microsoft.com/office/word/2018/wordml/cex" xmlns:w16cid="http://schemas.microsoft.com/office/word/2016/wordml/cid" xmlns:w16="http://schemas.microsoft.com/office/word/2018/wordml" xmlns:w16du="http://schemas.microsoft.com/office/word/2023/wordml/word16du" xmlns:w16sdtdh="http://schemas.microsoft.com/office/word/2020/wordml/sdtdatahash" xmlns:w16se="http://schemas.microsoft.com/office/word/2015/wordml/symex" mc:Ignorable="w14 w15 w16se w16cid w16 w16cex w16sdtdh w16du">
   <w:docDefaults>
     <w:rPrDefault>
       <w:rPr>
@@ -3897,6 +4515,28 @@
       <w:color w:val="2F5496" w:themeColor="accent1" w:themeShade="BF"/>
     </w:rPr>
   </w:style>
+  <w:style w:type="paragraph" w:styleId="Listaconvietas">
+    <w:name w:val="List Bullet"/>
+    <w:basedOn w:val="Normal"/>
+    <w:uiPriority w:val="99"/>
+    <w:semiHidden/>
+    <w:unhideWhenUsed/>
+    <w:rsid w:val="002F388A"/>
+    <w:pPr>
+      <w:tabs>
+        <w:tab w:val="left" w:pos="360"/>
+      </w:tabs>
+      <w:spacing w:before="100" w:beforeAutospacing="1" w:after="200" w:line="273" w:lineRule="auto"/>
+      <w:ind w:left="360" w:hanging="360"/>
+      <w:contextualSpacing/>
+    </w:pPr>
+    <w:rPr>
+      <w:rFonts w:ascii="Arial" w:eastAsia="MS Mincho" w:hAnsi="Arial" w:cs="Times New Roman"/>
+      <w:kern w:val="0"/>
+      <w:lang w:eastAsia="es-MX"/>
+      <w14:ligatures w14:val="none"/>
+    </w:rPr>
+  </w:style>
 </w:styles>
 </file>
 

</xml_diff>